<commit_message>
Squashed 'inputfiles/scdm_snapshot/' changes from 2b22d65..f3b3a4c
f3b3a4c Pull request #38: DEV-37044: Added snapshotDriver macro to avoid issue with IF statement in open code
f931816 DEV-37044: Update doc version number
eb7e933 DEV-37044: Update version number
796eb65 DEV-37044: Added snapshotDriver macro to avoid issue with IF statement in open code

git-subtree-dir: inputfiles/scdm_snapshot
git-subtree-split: f3b3a4c83c6bcb1cba591fca317186b8cfe0b269
</commit_message>
<xml_diff>
--- a/docs/Sentinel_SCDM_Snapshot_Report_Specification.docx
+++ b/docs/Sentinel_SCDM_Snapshot_Report_Specification.docx
@@ -471,18 +471,8 @@
           <w:sz w:val="24"/>
           <w:szCs w:val="24"/>
         </w:rPr>
-        <w:t>3.0.0</w:t>
+        <w:t>3.0.</w:t>
       </w:r>
-    </w:p>
-    <w:p>
-      <w:pPr>
-        <w:rPr>
-          <w:rFonts w:asciiTheme="majorHAnsi" w:hAnsiTheme="majorHAnsi"/>
-          <w:color w:val="0B294F" w:themeColor="accent1" w:themeShade="80"/>
-          <w:sz w:val="24"/>
-          <w:szCs w:val="24"/>
-        </w:rPr>
-      </w:pPr>
       <w:r>
         <w:rPr>
           <w:rFonts w:asciiTheme="majorHAnsi" w:hAnsiTheme="majorHAnsi"/>
@@ -490,7 +480,44 @@
           <w:sz w:val="24"/>
           <w:szCs w:val="24"/>
         </w:rPr>
-        <w:t>September 4</w:t>
+        <w:t>1</w:t>
+      </w:r>
+    </w:p>
+    <w:p>
+      <w:pPr>
+        <w:rPr>
+          <w:rFonts w:asciiTheme="majorHAnsi" w:hAnsiTheme="majorHAnsi"/>
+          <w:color w:val="0B294F" w:themeColor="accent1" w:themeShade="80"/>
+          <w:sz w:val="24"/>
+          <w:szCs w:val="24"/>
+        </w:rPr>
+      </w:pPr>
+      <w:r>
+        <w:rPr>
+          <w:rFonts w:asciiTheme="majorHAnsi" w:hAnsiTheme="majorHAnsi"/>
+          <w:color w:val="0B294F" w:themeColor="accent1" w:themeShade="80"/>
+          <w:sz w:val="24"/>
+          <w:szCs w:val="24"/>
+        </w:rPr>
+        <w:t>November</w:t>
+      </w:r>
+      <w:r>
+        <w:rPr>
+          <w:rFonts w:asciiTheme="majorHAnsi" w:hAnsiTheme="majorHAnsi"/>
+          <w:color w:val="0B294F" w:themeColor="accent1" w:themeShade="80"/>
+          <w:sz w:val="24"/>
+          <w:szCs w:val="24"/>
+        </w:rPr>
+        <w:t xml:space="preserve"> </w:t>
+      </w:r>
+      <w:r>
+        <w:rPr>
+          <w:rFonts w:asciiTheme="majorHAnsi" w:hAnsiTheme="majorHAnsi"/>
+          <w:color w:val="0B294F" w:themeColor="accent1" w:themeShade="80"/>
+          <w:sz w:val="24"/>
+          <w:szCs w:val="24"/>
+        </w:rPr>
+        <w:t>22</w:t>
       </w:r>
       <w:r>
         <w:rPr>
@@ -4051,7 +4078,7 @@
           </w:tcPr>
           <w:p>
             <w:r>
-              <w:t>3.0.0</w:t>
+              <w:t>3.0.1</w:t>
             </w:r>
           </w:p>
         </w:tc>
@@ -4061,7 +4088,7 @@
           </w:tcPr>
           <w:p>
             <w:r>
-              <w:t>09/06/2024</w:t>
+              <w:t>11/22/2024</w:t>
             </w:r>
           </w:p>
         </w:tc>
@@ -4079,7 +4106,7 @@
               <w:ind w:left="156" w:hanging="180"/>
             </w:pPr>
             <w:r>
-              <w:t>Major Refactoring</w:t>
+              <w:t>Minor bugfix</w:t>
             </w:r>
           </w:p>
         </w:tc>
@@ -4101,7 +4128,7 @@
           </w:tcPr>
           <w:p>
             <w:r>
-              <w:t>2.3.1</w:t>
+              <w:t>3.0.0</w:t>
             </w:r>
           </w:p>
         </w:tc>
@@ -4111,7 +4138,7 @@
           </w:tcPr>
           <w:p>
             <w:r>
-              <w:t>12/23/2021</w:t>
+              <w:t>09/06/2024</w:t>
             </w:r>
           </w:p>
         </w:tc>
@@ -4129,31 +4156,7 @@
               <w:ind w:left="156" w:hanging="180"/>
             </w:pPr>
             <w:r>
-              <w:t xml:space="preserve">Refined logic to exclude </w:t>
-            </w:r>
-            <w:proofErr w:type="spellStart"/>
-            <w:r>
-              <w:t>mpatid</w:t>
-            </w:r>
-            <w:proofErr w:type="spellEnd"/>
-            <w:r>
-              <w:t xml:space="preserve"> and </w:t>
-            </w:r>
-            <w:proofErr w:type="spellStart"/>
-            <w:r>
-              <w:t>cpatid</w:t>
-            </w:r>
-            <w:proofErr w:type="spellEnd"/>
-            <w:r>
-              <w:t xml:space="preserve"> for Mother Infant Linkage (MIL) table when </w:t>
-            </w:r>
-            <w:proofErr w:type="spellStart"/>
-            <w:r>
-              <w:t>patid</w:t>
-            </w:r>
-            <w:proofErr w:type="spellEnd"/>
-            <w:r>
-              <w:t xml:space="preserve"> occurs in PTSTOEXCLUDE</w:t>
+              <w:t>Major Refactoring</w:t>
             </w:r>
           </w:p>
         </w:tc>
@@ -4172,6 +4175,56 @@
         <w:trPr>
           <w:cnfStyle w:val="000000100000" w:firstRow="0" w:lastRow="0" w:firstColumn="0" w:lastColumn="0" w:oddVBand="0" w:evenVBand="0" w:oddHBand="1" w:evenHBand="0" w:firstRowFirstColumn="0" w:firstRowLastColumn="0" w:lastRowFirstColumn="0" w:lastRowLastColumn="0"/>
         </w:trPr>
+        <w:tc>
+          <w:tcPr>
+            <w:tcW w:w="488" w:type="pct"/>
+          </w:tcPr>
+          <w:p>
+            <w:r>
+              <w:t>2.3.1</w:t>
+            </w:r>
+          </w:p>
+        </w:tc>
+        <w:tc>
+          <w:tcPr>
+            <w:tcW w:w="714" w:type="pct"/>
+          </w:tcPr>
+          <w:p>
+            <w:r>
+              <w:t>12/23/2021</w:t>
+            </w:r>
+          </w:p>
+        </w:tc>
+        <w:tc>
+          <w:tcPr>
+            <w:tcW w:w="2376" w:type="pct"/>
+          </w:tcPr>
+          <w:p>
+            <w:pPr>
+              <w:pStyle w:val="ListParagraph"/>
+              <w:numPr>
+                <w:ilvl w:val="0"/>
+                <w:numId w:val="33"/>
+              </w:numPr>
+              <w:ind w:left="156" w:hanging="180"/>
+            </w:pPr>
+            <w:r>
+              <w:t>Refined logic to exclude mpatid and cpatid for Mother Infant Linkage (MIL) table when patid occurs in PTSTOEXCLUDE</w:t>
+            </w:r>
+          </w:p>
+        </w:tc>
+        <w:tc>
+          <w:tcPr>
+            <w:tcW w:w="1422" w:type="pct"/>
+          </w:tcPr>
+          <w:p>
+            <w:r>
+              <w:t>Sentinel Operations Center</w:t>
+            </w:r>
+          </w:p>
+        </w:tc>
+      </w:tr>
+      <w:tr>
         <w:tc>
           <w:tcPr>
             <w:tcW w:w="0" w:type="pct"/>
@@ -4220,23 +4273,7 @@
               <w:ind w:left="156" w:hanging="180"/>
             </w:pPr>
             <w:r>
-              <w:t>Add DEM output tables “</w:t>
-            </w:r>
-            <w:proofErr w:type="spellStart"/>
-            <w:r>
-              <w:t>dem_hispanicct_md</w:t>
-            </w:r>
-            <w:proofErr w:type="spellEnd"/>
-            <w:r>
-              <w:t>” and “</w:t>
-            </w:r>
-            <w:proofErr w:type="spellStart"/>
-            <w:r>
-              <w:t>dem_racect_md</w:t>
-            </w:r>
-            <w:proofErr w:type="spellEnd"/>
-            <w:r>
-              <w:t>”</w:t>
+              <w:t>Add DEM output tables “dem_hispanicct_md” and “dem_racect_md”</w:t>
             </w:r>
           </w:p>
         </w:tc>
@@ -4258,6 +4295,9 @@
         </w:tc>
       </w:tr>
       <w:tr>
+        <w:trPr>
+          <w:cnfStyle w:val="000000100000" w:firstRow="0" w:lastRow="0" w:firstColumn="0" w:lastColumn="0" w:oddVBand="0" w:evenVBand="0" w:oddHBand="1" w:evenHBand="0" w:firstRowFirstColumn="0" w:firstRowLastColumn="0" w:lastRowFirstColumn="0" w:lastRowLastColumn="0"/>
+        </w:trPr>
         <w:tc>
           <w:tcPr>
             <w:tcW w:w="0" w:type="pct"/>
@@ -4313,11 +4353,9 @@
             <w:r>
               <w:t>“</w:t>
             </w:r>
-            <w:proofErr w:type="spellStart"/>
             <w:r>
               <w:t>enr_reclength_md_y</w:t>
             </w:r>
-            <w:proofErr w:type="spellEnd"/>
             <w:r>
               <w:t>”</w:t>
             </w:r>
@@ -4327,14 +4365,12 @@
             <w:r>
               <w:t>“</w:t>
             </w:r>
-            <w:proofErr w:type="spellStart"/>
             <w:r>
               <w:t>enr_patid_ct_md_</w:t>
             </w:r>
             <w:r>
               <w:t>y</w:t>
             </w:r>
-            <w:proofErr w:type="spellEnd"/>
             <w:r>
               <w:t>”</w:t>
             </w:r>
@@ -4382,13 +4418,8 @@
             <w:r>
               <w:t>output table “</w:t>
             </w:r>
-            <w:proofErr w:type="spellStart"/>
-            <w:r>
-              <w:t>mil_linkage_rates</w:t>
-            </w:r>
-            <w:proofErr w:type="spellEnd"/>
-            <w:r>
-              <w:t>”</w:t>
+            <w:r>
+              <w:t>mil_linkage_rates”</w:t>
             </w:r>
             <w:r>
               <w:t xml:space="preserve"> </w:t>
@@ -4410,9 +4441,6 @@
         </w:tc>
       </w:tr>
       <w:tr>
-        <w:trPr>
-          <w:cnfStyle w:val="000000100000" w:firstRow="0" w:lastRow="0" w:firstColumn="0" w:lastColumn="0" w:oddVBand="0" w:evenVBand="0" w:oddHBand="1" w:evenHBand="0" w:firstRowFirstColumn="0" w:firstRowLastColumn="0" w:lastRowFirstColumn="0" w:lastRowLastColumn="0"/>
-        </w:trPr>
         <w:tc>
           <w:tcPr>
             <w:tcW w:w="0" w:type="pct"/>
@@ -4457,15 +4485,7 @@
               <w:ind w:left="156" w:hanging="180"/>
             </w:pPr>
             <w:r>
-              <w:t>Update logic for “</w:t>
-            </w:r>
-            <w:proofErr w:type="spellStart"/>
-            <w:r>
-              <w:t>enr_pat_covlength_md</w:t>
-            </w:r>
-            <w:proofErr w:type="spellEnd"/>
-            <w:r>
-              <w:t>” to span enrollment gaps up to 45 days</w:t>
+              <w:t>Update logic for “enr_pat_covlength_md” to span enrollment gaps up to 45 days</w:t>
             </w:r>
           </w:p>
           <w:p>
@@ -4480,11 +4500,9 @@
             <w:r>
               <w:t>Update logic for “</w:t>
             </w:r>
-            <w:proofErr w:type="spellStart"/>
             <w:r>
               <w:t>dem_pat_agecount_md</w:t>
             </w:r>
-            <w:proofErr w:type="spellEnd"/>
             <w:r>
               <w:t>” to use the earliest enrollment start date to calculate age.</w:t>
             </w:r>
@@ -4512,15 +4530,7 @@
               <w:ind w:left="156" w:hanging="180"/>
             </w:pPr>
             <w:r>
-              <w:t xml:space="preserve">Bug fix for zip code </w:t>
-            </w:r>
-            <w:proofErr w:type="spellStart"/>
-            <w:r>
-              <w:t>inputfile</w:t>
-            </w:r>
-            <w:proofErr w:type="spellEnd"/>
-            <w:r>
-              <w:t xml:space="preserve"> (missing “AS”</w:t>
+              <w:t>Bug fix for zip code inputfile (missing “AS”</w:t>
             </w:r>
             <w:r>
               <w:t>)</w:t>
@@ -4539,13 +4549,8 @@
               <w:t>Conditional code to work for SCDM v7.X.X and 8.X.X</w:t>
             </w:r>
             <w:r>
-              <w:t xml:space="preserve"> for DEM.zip vs. </w:t>
-            </w:r>
-            <w:proofErr w:type="spellStart"/>
-            <w:r>
-              <w:t>DEM.postalcode</w:t>
-            </w:r>
-            <w:proofErr w:type="spellEnd"/>
+              <w:t xml:space="preserve"> for DEM.zip vs. DEM.postalcode</w:t>
+            </w:r>
           </w:p>
           <w:p>
             <w:pPr>
@@ -4573,6 +4578,9 @@
         </w:tc>
       </w:tr>
       <w:tr>
+        <w:trPr>
+          <w:cnfStyle w:val="000000100000" w:firstRow="0" w:lastRow="0" w:firstColumn="0" w:lastColumn="0" w:oddVBand="0" w:evenVBand="0" w:oddHBand="1" w:evenHBand="0" w:firstRowFirstColumn="0" w:firstRowLastColumn="0" w:lastRowFirstColumn="0" w:lastRowLastColumn="0"/>
+        </w:trPr>
         <w:tc>
           <w:tcPr>
             <w:tcW w:w="0" w:type="pct"/>
@@ -4624,15 +4632,7 @@
               <w:ind w:left="156" w:hanging="180"/>
             </w:pPr>
             <w:r>
-              <w:t xml:space="preserve">Delete </w:t>
-            </w:r>
-            <w:proofErr w:type="spellStart"/>
-            <w:r>
-              <w:t>dplocal</w:t>
-            </w:r>
-            <w:proofErr w:type="spellEnd"/>
-            <w:r>
-              <w:t xml:space="preserve"> files at end of program</w:t>
+              <w:t>Delete dplocal files at end of program</w:t>
             </w:r>
           </w:p>
         </w:tc>
@@ -4648,9 +4648,6 @@
         </w:tc>
       </w:tr>
       <w:tr>
-        <w:trPr>
-          <w:cnfStyle w:val="000000100000" w:firstRow="0" w:lastRow="0" w:firstColumn="0" w:lastColumn="0" w:oddVBand="0" w:evenVBand="0" w:oddHBand="1" w:evenHBand="0" w:firstRowFirstColumn="0" w:firstRowLastColumn="0" w:lastRowFirstColumn="0" w:lastRowLastColumn="0"/>
-        </w:trPr>
         <w:tc>
           <w:tcPr>
             <w:tcW w:w="488" w:type="pct"/>
@@ -4730,6 +4727,9 @@
         </w:tc>
       </w:tr>
       <w:tr>
+        <w:trPr>
+          <w:cnfStyle w:val="000000100000" w:firstRow="0" w:lastRow="0" w:firstColumn="0" w:lastColumn="0" w:oddVBand="0" w:evenVBand="0" w:oddHBand="1" w:evenHBand="0" w:firstRowFirstColumn="0" w:firstRowLastColumn="0" w:lastRowFirstColumn="0" w:lastRowLastColumn="0"/>
+        </w:trPr>
         <w:tc>
           <w:tcPr>
             <w:tcW w:w="488" w:type="pct"/>
@@ -4757,6 +4757,48 @@
           <w:p>
             <w:r>
               <w:t>Update metrics based on FDA feedback and Sentinel website needs</w:t>
+            </w:r>
+          </w:p>
+        </w:tc>
+        <w:tc>
+          <w:tcPr>
+            <w:tcW w:w="1422" w:type="pct"/>
+          </w:tcPr>
+          <w:p>
+            <w:r>
+              <w:t>Sentinel Operations Center</w:t>
+            </w:r>
+          </w:p>
+        </w:tc>
+      </w:tr>
+      <w:tr>
+        <w:tc>
+          <w:tcPr>
+            <w:tcW w:w="488" w:type="pct"/>
+          </w:tcPr>
+          <w:p>
+            <w:r>
+              <w:t>1.1.0</w:t>
+            </w:r>
+          </w:p>
+        </w:tc>
+        <w:tc>
+          <w:tcPr>
+            <w:tcW w:w="714" w:type="pct"/>
+          </w:tcPr>
+          <w:p>
+            <w:r>
+              <w:t>10/15/2019</w:t>
+            </w:r>
+          </w:p>
+        </w:tc>
+        <w:tc>
+          <w:tcPr>
+            <w:tcW w:w="2376" w:type="pct"/>
+          </w:tcPr>
+          <w:p>
+            <w:r>
+              <w:t>Include new Sentinel master program header and update Common Components macro variables based on changes made for Sentinel Common Data Model (SCDM) version 7.0.0.</w:t>
             </w:r>
           </w:p>
         </w:tc>
@@ -4775,48 +4817,6 @@
         <w:trPr>
           <w:cnfStyle w:val="000000100000" w:firstRow="0" w:lastRow="0" w:firstColumn="0" w:lastColumn="0" w:oddVBand="0" w:evenVBand="0" w:oddHBand="1" w:evenHBand="0" w:firstRowFirstColumn="0" w:firstRowLastColumn="0" w:lastRowFirstColumn="0" w:lastRowLastColumn="0"/>
         </w:trPr>
-        <w:tc>
-          <w:tcPr>
-            <w:tcW w:w="488" w:type="pct"/>
-          </w:tcPr>
-          <w:p>
-            <w:r>
-              <w:t>1.1.0</w:t>
-            </w:r>
-          </w:p>
-        </w:tc>
-        <w:tc>
-          <w:tcPr>
-            <w:tcW w:w="714" w:type="pct"/>
-          </w:tcPr>
-          <w:p>
-            <w:r>
-              <w:t>10/15/2019</w:t>
-            </w:r>
-          </w:p>
-        </w:tc>
-        <w:tc>
-          <w:tcPr>
-            <w:tcW w:w="2376" w:type="pct"/>
-          </w:tcPr>
-          <w:p>
-            <w:r>
-              <w:t>Include new Sentinel master program header and update Common Components macro variables based on changes made for Sentinel Common Data Model (SCDM) version 7.0.0.</w:t>
-            </w:r>
-          </w:p>
-        </w:tc>
-        <w:tc>
-          <w:tcPr>
-            <w:tcW w:w="1422" w:type="pct"/>
-          </w:tcPr>
-          <w:p>
-            <w:r>
-              <w:t>Sentinel Operations Center</w:t>
-            </w:r>
-          </w:p>
-        </w:tc>
-      </w:tr>
-      <w:tr>
         <w:tc>
           <w:tcPr>
             <w:tcW w:w="488" w:type="pct"/>
@@ -4891,14 +4891,14 @@
       <w:pPr>
         <w:pStyle w:val="Heading1"/>
       </w:pPr>
-      <w:bookmarkStart w:id="40" w:name="_Toc32229615"/>
-      <w:bookmarkStart w:id="41" w:name="_Toc176524903"/>
+      <w:bookmarkStart w:id="20" w:name="_Toc32229615"/>
+      <w:bookmarkStart w:id="21" w:name="_Toc176524903"/>
       <w:r>
         <w:lastRenderedPageBreak/>
         <w:t>Overview</w:t>
       </w:r>
-      <w:bookmarkEnd w:id="40"/>
-      <w:bookmarkEnd w:id="41"/>
+      <w:bookmarkEnd w:id="20"/>
+      <w:bookmarkEnd w:id="21"/>
     </w:p>
     <w:p>
       <w:r>
@@ -4909,7 +4909,6 @@
       <w:r>
         <w:t xml:space="preserve">For methods sections, </w:t>
       </w:r>
-      <w:proofErr w:type="spellStart"/>
       <w:r>
         <w:rPr>
           <w:i/>
@@ -4917,7 +4916,6 @@
         </w:rPr>
         <w:t>TableName.VariableName</w:t>
       </w:r>
-      <w:proofErr w:type="spellEnd"/>
       <w:r>
         <w:t xml:space="preserve"> will be commonly used to indicate which tables and variables are being referenced.</w:t>
       </w:r>
@@ -4926,14 +4924,14 @@
       <w:pPr>
         <w:pStyle w:val="Heading1"/>
       </w:pPr>
-      <w:bookmarkStart w:id="42" w:name="_Toc176524904"/>
+      <w:bookmarkStart w:id="22" w:name="_Toc176524904"/>
       <w:r>
         <w:t xml:space="preserve">Website </w:t>
       </w:r>
       <w:r>
         <w:t>content</w:t>
       </w:r>
-      <w:bookmarkEnd w:id="42"/>
+      <w:bookmarkEnd w:id="22"/>
     </w:p>
     <w:p>
       <w:r>
@@ -5096,11 +5094,9 @@
             <w:vAlign w:val="center"/>
           </w:tcPr>
           <w:p>
-            <w:proofErr w:type="spellStart"/>
             <w:r>
               <w:t>enr_active_patid_ct_md</w:t>
             </w:r>
-            <w:proofErr w:type="spellEnd"/>
           </w:p>
         </w:tc>
       </w:tr>
@@ -5140,13 +5136,8 @@
           </w:tcPr>
           <w:p>
             <w:r>
-              <w:t xml:space="preserve">Pharmacy </w:t>
-            </w:r>
-            <w:proofErr w:type="spellStart"/>
-            <w:r>
-              <w:t>dispensings</w:t>
-            </w:r>
-            <w:proofErr w:type="spellEnd"/>
+              <w:t>Pharmacy dispensings</w:t>
+            </w:r>
           </w:p>
         </w:tc>
         <w:tc>
@@ -5155,11 +5146,9 @@
             <w:vAlign w:val="center"/>
           </w:tcPr>
           <w:p>
-            <w:proofErr w:type="spellStart"/>
             <w:r>
               <w:t>dis_pat_rxcount_md</w:t>
             </w:r>
-            <w:proofErr w:type="spellEnd"/>
           </w:p>
         </w:tc>
       </w:tr>
@@ -5206,11 +5195,9 @@
             <w:vAlign w:val="center"/>
           </w:tcPr>
           <w:p>
-            <w:proofErr w:type="spellStart"/>
             <w:r>
               <w:t>enc_pat_enccount_md</w:t>
             </w:r>
-            <w:proofErr w:type="spellEnd"/>
           </w:p>
         </w:tc>
       </w:tr>
@@ -5260,11 +5247,9 @@
             <w:vAlign w:val="center"/>
           </w:tcPr>
           <w:p>
-            <w:proofErr w:type="spellStart"/>
             <w:r>
               <w:t>lab_pat_testcount_md</w:t>
             </w:r>
-            <w:proofErr w:type="spellEnd"/>
           </w:p>
         </w:tc>
       </w:tr>
@@ -5313,11 +5298,9 @@
             <w:vAlign w:val="center"/>
           </w:tcPr>
           <w:p>
-            <w:proofErr w:type="spellStart"/>
             <w:r>
               <w:t>vit_pat_vitct_md</w:t>
             </w:r>
-            <w:proofErr w:type="spellEnd"/>
           </w:p>
         </w:tc>
       </w:tr>
@@ -5362,11 +5345,9 @@
             <w:vAlign w:val="center"/>
           </w:tcPr>
           <w:p>
-            <w:proofErr w:type="spellStart"/>
             <w:r>
               <w:t>dth_dthct_md</w:t>
             </w:r>
-            <w:proofErr w:type="spellEnd"/>
           </w:p>
         </w:tc>
       </w:tr>
@@ -5408,11 +5389,9 @@
             <w:vAlign w:val="center"/>
           </w:tcPr>
           <w:p>
-            <w:proofErr w:type="spellStart"/>
             <w:r>
               <w:t>cod_pat_codct_md</w:t>
             </w:r>
-            <w:proofErr w:type="spellEnd"/>
           </w:p>
         </w:tc>
       </w:tr>
@@ -5451,11 +5430,9 @@
             <w:vAlign w:val="center"/>
           </w:tcPr>
           <w:p>
-            <w:proofErr w:type="spellStart"/>
             <w:r>
               <w:t>enr_rec_covlength_md</w:t>
             </w:r>
-            <w:proofErr w:type="spellEnd"/>
           </w:p>
         </w:tc>
       </w:tr>
@@ -5529,11 +5506,9 @@
                 <w:szCs w:val="22"/>
               </w:rPr>
             </w:pPr>
-            <w:proofErr w:type="spellStart"/>
             <w:r>
               <w:t>enr_pat_covlength_md</w:t>
             </w:r>
-            <w:proofErr w:type="spellEnd"/>
           </w:p>
         </w:tc>
       </w:tr>
@@ -5574,11 +5549,9 @@
                 <w:tab w:val="left" w:pos="1284"/>
               </w:tabs>
             </w:pPr>
-            <w:proofErr w:type="spellStart"/>
             <w:r>
               <w:t>dem_geolocct_md</w:t>
             </w:r>
-            <w:proofErr w:type="spellEnd"/>
           </w:p>
         </w:tc>
       </w:tr>
@@ -5625,7 +5598,6 @@
                 <w:tab w:val="left" w:pos="1284"/>
               </w:tabs>
             </w:pPr>
-            <w:proofErr w:type="spellStart"/>
             <w:r>
               <w:t>dem_pat_</w:t>
             </w:r>
@@ -5635,7 +5607,6 @@
             <w:r>
               <w:t>agecount_md</w:t>
             </w:r>
-            <w:proofErr w:type="spellEnd"/>
             <w:r>
               <w:t xml:space="preserve">, </w:t>
             </w:r>
@@ -5679,7 +5650,6 @@
                 <w:tab w:val="left" w:pos="1284"/>
               </w:tabs>
             </w:pPr>
-            <w:proofErr w:type="spellStart"/>
             <w:r>
               <w:t>dem_pat_</w:t>
             </w:r>
@@ -5689,7 +5659,6 @@
             <w:r>
               <w:t>agecount_md</w:t>
             </w:r>
-            <w:proofErr w:type="spellEnd"/>
           </w:p>
         </w:tc>
       </w:tr>
@@ -5725,11 +5694,9 @@
             <w:vAlign w:val="center"/>
           </w:tcPr>
           <w:p>
-            <w:proofErr w:type="spellStart"/>
             <w:r>
               <w:t>dem_sexct_md</w:t>
             </w:r>
-            <w:proofErr w:type="spellEnd"/>
           </w:p>
         </w:tc>
       </w:tr>
@@ -6010,7 +5977,6 @@
                 <w:szCs w:val="20"/>
               </w:rPr>
             </w:pPr>
-            <w:proofErr w:type="spellStart"/>
             <w:r>
               <w:rPr>
                 <w:sz w:val="20"/>
@@ -6018,7 +5984,6 @@
               </w:rPr>
               <w:t>enr_pat_ct_md</w:t>
             </w:r>
-            <w:proofErr w:type="spellEnd"/>
           </w:p>
         </w:tc>
       </w:tr>
@@ -6077,7 +6042,6 @@
                 <w:szCs w:val="20"/>
               </w:rPr>
             </w:pPr>
-            <w:proofErr w:type="spellStart"/>
             <w:r>
               <w:rPr>
                 <w:sz w:val="20"/>
@@ -6085,7 +6049,6 @@
               </w:rPr>
               <w:t>enr_pat_ct_md_y</w:t>
             </w:r>
-            <w:proofErr w:type="spellEnd"/>
           </w:p>
         </w:tc>
       </w:tr>
@@ -6154,8 +6117,7 @@
                 <w:szCs w:val="20"/>
               </w:rPr>
             </w:pPr>
-            <w:bookmarkStart w:id="43" w:name="_Toc176524905"/>
-            <w:proofErr w:type="spellStart"/>
+            <w:bookmarkStart w:id="23" w:name="_Toc176524905"/>
             <w:r>
               <w:rPr>
                 <w:rFonts w:asciiTheme="minorHAnsi" w:hAnsiTheme="minorHAnsi"/>
@@ -6164,8 +6126,7 @@
               </w:rPr>
               <w:t>mil_linkage_rates</w:t>
             </w:r>
-            <w:bookmarkEnd w:id="43"/>
-            <w:proofErr w:type="spellEnd"/>
+            <w:bookmarkEnd w:id="23"/>
           </w:p>
         </w:tc>
       </w:tr>
@@ -6231,8 +6192,7 @@
                 <w:szCs w:val="20"/>
               </w:rPr>
             </w:pPr>
-            <w:bookmarkStart w:id="44" w:name="_Toc176524906"/>
-            <w:proofErr w:type="spellStart"/>
+            <w:bookmarkStart w:id="24" w:name="_Toc176524906"/>
             <w:r>
               <w:rPr>
                 <w:rFonts w:asciiTheme="minorHAnsi" w:hAnsiTheme="minorHAnsi"/>
@@ -6241,8 +6201,7 @@
               </w:rPr>
               <w:t>mil_linkage_rates</w:t>
             </w:r>
-            <w:bookmarkEnd w:id="44"/>
-            <w:proofErr w:type="spellEnd"/>
+            <w:bookmarkEnd w:id="24"/>
           </w:p>
         </w:tc>
       </w:tr>
@@ -6311,8 +6270,7 @@
                 <w:szCs w:val="20"/>
               </w:rPr>
             </w:pPr>
-            <w:bookmarkStart w:id="45" w:name="_Toc176524907"/>
-            <w:proofErr w:type="spellStart"/>
+            <w:bookmarkStart w:id="25" w:name="_Toc176524907"/>
             <w:r>
               <w:rPr>
                 <w:rFonts w:asciiTheme="minorHAnsi" w:hAnsiTheme="minorHAnsi"/>
@@ -6321,8 +6279,7 @@
               </w:rPr>
               <w:t>mil_linkage_rates</w:t>
             </w:r>
-            <w:bookmarkEnd w:id="45"/>
-            <w:proofErr w:type="spellEnd"/>
+            <w:bookmarkEnd w:id="25"/>
           </w:p>
         </w:tc>
       </w:tr>
@@ -6388,8 +6345,7 @@
                 <w:szCs w:val="20"/>
               </w:rPr>
             </w:pPr>
-            <w:bookmarkStart w:id="46" w:name="_Toc176524908"/>
-            <w:proofErr w:type="spellStart"/>
+            <w:bookmarkStart w:id="26" w:name="_Toc176524908"/>
             <w:r>
               <w:rPr>
                 <w:rFonts w:asciiTheme="minorHAnsi" w:hAnsiTheme="minorHAnsi"/>
@@ -6398,8 +6354,7 @@
               </w:rPr>
               <w:t>mil_linkage_rates</w:t>
             </w:r>
-            <w:bookmarkEnd w:id="46"/>
-            <w:proofErr w:type="spellEnd"/>
+            <w:bookmarkEnd w:id="26"/>
           </w:p>
         </w:tc>
       </w:tr>
@@ -6408,25 +6363,25 @@
       <w:pPr>
         <w:pStyle w:val="Heading1"/>
       </w:pPr>
-      <w:bookmarkStart w:id="47" w:name="_Toc44432101"/>
-      <w:bookmarkStart w:id="48" w:name="_Toc47686756"/>
-      <w:bookmarkStart w:id="49" w:name="_Toc176524909"/>
-      <w:bookmarkEnd w:id="47"/>
-      <w:bookmarkEnd w:id="48"/>
+      <w:bookmarkStart w:id="27" w:name="_Toc44432101"/>
+      <w:bookmarkStart w:id="28" w:name="_Toc47686756"/>
+      <w:bookmarkStart w:id="29" w:name="_Toc176524909"/>
+      <w:bookmarkEnd w:id="27"/>
+      <w:bookmarkEnd w:id="28"/>
       <w:r>
         <w:t>Functional Specifications</w:t>
       </w:r>
-      <w:bookmarkEnd w:id="49"/>
+      <w:bookmarkEnd w:id="29"/>
     </w:p>
     <w:p>
       <w:pPr>
         <w:pStyle w:val="Heading2"/>
       </w:pPr>
-      <w:bookmarkStart w:id="50" w:name="_Toc176524910"/>
+      <w:bookmarkStart w:id="30" w:name="_Toc176524910"/>
       <w:r>
         <w:t>Method for Bridging Enrollment Spans</w:t>
       </w:r>
-      <w:bookmarkEnd w:id="50"/>
+      <w:bookmarkEnd w:id="30"/>
     </w:p>
     <w:p>
       <w:pPr>
@@ -6518,7 +6473,6 @@
                 <w:szCs w:val="20"/>
               </w:rPr>
             </w:pPr>
-            <w:proofErr w:type="spellStart"/>
             <w:r>
               <w:rPr>
                 <w:rFonts w:cstheme="majorHAnsi"/>
@@ -6527,7 +6481,6 @@
               </w:rPr>
               <w:t>Enr_Start</w:t>
             </w:r>
-            <w:proofErr w:type="spellEnd"/>
           </w:p>
         </w:tc>
         <w:tc>
@@ -6545,7 +6498,6 @@
                 <w:szCs w:val="20"/>
               </w:rPr>
             </w:pPr>
-            <w:proofErr w:type="spellStart"/>
             <w:r>
               <w:rPr>
                 <w:rFonts w:cstheme="majorHAnsi"/>
@@ -6554,7 +6506,6 @@
               </w:rPr>
               <w:t>Enr_End</w:t>
             </w:r>
-            <w:proofErr w:type="spellEnd"/>
           </w:p>
         </w:tc>
         <w:tc>
@@ -7018,36 +6969,8 @@
                 <w:sz w:val="20"/>
                 <w:szCs w:val="20"/>
               </w:rPr>
-              <w:t xml:space="preserve">Merge records into one, keeping earliest </w:t>
-            </w:r>
-            <w:proofErr w:type="spellStart"/>
-            <w:r>
-              <w:rPr>
-                <w:rFonts w:cstheme="majorHAnsi"/>
-                <w:sz w:val="20"/>
-                <w:szCs w:val="20"/>
-              </w:rPr>
-              <w:t>Enr_start</w:t>
-            </w:r>
-            <w:proofErr w:type="spellEnd"/>
-            <w:r>
-              <w:rPr>
-                <w:rFonts w:cstheme="majorHAnsi"/>
-                <w:sz w:val="20"/>
-                <w:szCs w:val="20"/>
-              </w:rPr>
-              <w:t xml:space="preserve"> and latest </w:t>
-            </w:r>
-            <w:proofErr w:type="spellStart"/>
-            <w:r>
-              <w:rPr>
-                <w:rFonts w:cstheme="majorHAnsi"/>
-                <w:sz w:val="20"/>
-                <w:szCs w:val="20"/>
-              </w:rPr>
-              <w:t>Enr_end</w:t>
-            </w:r>
-            <w:proofErr w:type="spellEnd"/>
+              <w:t>Merge records into one, keeping earliest Enr_start and latest Enr_end</w:t>
+            </w:r>
           </w:p>
         </w:tc>
       </w:tr>
@@ -7319,36 +7242,8 @@
                 <w:sz w:val="20"/>
                 <w:szCs w:val="20"/>
               </w:rPr>
-              <w:t xml:space="preserve">Merge records into one, keeping earliest </w:t>
-            </w:r>
-            <w:proofErr w:type="spellStart"/>
-            <w:r>
-              <w:rPr>
-                <w:rFonts w:cstheme="majorHAnsi"/>
-                <w:sz w:val="20"/>
-                <w:szCs w:val="20"/>
-              </w:rPr>
-              <w:t>Enr_start</w:t>
-            </w:r>
-            <w:proofErr w:type="spellEnd"/>
-            <w:r>
-              <w:rPr>
-                <w:rFonts w:cstheme="majorHAnsi"/>
-                <w:sz w:val="20"/>
-                <w:szCs w:val="20"/>
-              </w:rPr>
-              <w:t xml:space="preserve"> and latest </w:t>
-            </w:r>
-            <w:proofErr w:type="spellStart"/>
-            <w:r>
-              <w:rPr>
-                <w:rFonts w:cstheme="majorHAnsi"/>
-                <w:sz w:val="20"/>
-                <w:szCs w:val="20"/>
-              </w:rPr>
-              <w:t>Enr_end</w:t>
-            </w:r>
-            <w:proofErr w:type="spellEnd"/>
+              <w:t>Merge records into one, keeping earliest Enr_start and latest Enr_end</w:t>
+            </w:r>
           </w:p>
         </w:tc>
       </w:tr>
@@ -7617,18 +7512,8 @@
                 <w:sz w:val="20"/>
                 <w:szCs w:val="20"/>
               </w:rPr>
-              <w:t xml:space="preserve">Keep the first record and output second record to </w:t>
-            </w:r>
-            <w:proofErr w:type="spellStart"/>
-            <w:r>
-              <w:rPr>
-                <w:rFonts w:cstheme="majorHAnsi"/>
-                <w:sz w:val="20"/>
-                <w:szCs w:val="20"/>
-              </w:rPr>
-              <w:t>dplocal.enroll_dup</w:t>
-            </w:r>
-            <w:proofErr w:type="spellEnd"/>
+              <w:t>Keep the first record and output second record to dplocal.enroll_dup</w:t>
+            </w:r>
           </w:p>
         </w:tc>
       </w:tr>
@@ -7898,18 +7783,8 @@
                 <w:sz w:val="20"/>
                 <w:szCs w:val="20"/>
               </w:rPr>
-              <w:t xml:space="preserve">Keep the first record and output other record to </w:t>
-            </w:r>
-            <w:proofErr w:type="spellStart"/>
-            <w:r>
-              <w:rPr>
-                <w:rFonts w:cstheme="majorHAnsi"/>
-                <w:sz w:val="20"/>
-                <w:szCs w:val="20"/>
-              </w:rPr>
-              <w:t>dplocal.enroll_dup</w:t>
-            </w:r>
-            <w:proofErr w:type="spellEnd"/>
+              <w:t>Keep the first record and output other record to dplocal.enroll_dup</w:t>
+            </w:r>
           </w:p>
         </w:tc>
       </w:tr>
@@ -8168,36 +8043,8 @@
                 <w:sz w:val="20"/>
                 <w:szCs w:val="20"/>
               </w:rPr>
-              <w:t xml:space="preserve">Merge records into one, keeping the earliest </w:t>
-            </w:r>
-            <w:proofErr w:type="spellStart"/>
-            <w:r>
-              <w:rPr>
-                <w:rFonts w:cstheme="majorHAnsi"/>
-                <w:sz w:val="20"/>
-                <w:szCs w:val="20"/>
-              </w:rPr>
-              <w:t>Enr_start</w:t>
-            </w:r>
-            <w:proofErr w:type="spellEnd"/>
-            <w:r>
-              <w:rPr>
-                <w:rFonts w:cstheme="majorHAnsi"/>
-                <w:sz w:val="20"/>
-                <w:szCs w:val="20"/>
-              </w:rPr>
-              <w:t xml:space="preserve"> and latest </w:t>
-            </w:r>
-            <w:proofErr w:type="spellStart"/>
-            <w:r>
-              <w:rPr>
-                <w:rFonts w:cstheme="majorHAnsi"/>
-                <w:sz w:val="20"/>
-                <w:szCs w:val="20"/>
-              </w:rPr>
-              <w:t>Enr_end</w:t>
-            </w:r>
-            <w:proofErr w:type="spellEnd"/>
+              <w:t>Merge records into one, keeping the earliest Enr_start and latest Enr_end</w:t>
+            </w:r>
           </w:p>
         </w:tc>
       </w:tr>
@@ -8306,32 +8153,8 @@
         <w:spacing w:before="240" w:after="0"/>
       </w:pPr>
       <w:r>
-        <w:t xml:space="preserve">Using </w:t>
+        <w:t>Using ms_delpatients macro, remove observations from the Enrollment table where the patid has been specified in PTSTOEXCLUDE. Due to the nature of these metrics being based upon enrollment status, these patients will be removed from any remaining analyses</w:t>
       </w:r>
-      <w:proofErr w:type="spellStart"/>
-      <w:r>
-        <w:t>ms_delpatients</w:t>
-      </w:r>
-      <w:proofErr w:type="spellEnd"/>
-      <w:r>
-        <w:t xml:space="preserve"> macro, remove observations from the Enrollment table where the </w:t>
-      </w:r>
-      <w:proofErr w:type="spellStart"/>
-      <w:r>
-        <w:t>patid</w:t>
-      </w:r>
-      <w:proofErr w:type="spellEnd"/>
-      <w:r>
-        <w:t xml:space="preserve"> has been specified in PTSTOEXCLUDE. Due to the nature of these metrics being based upon enrollment status, these patients will be removed from any remaining </w:t>
-      </w:r>
-      <w:proofErr w:type="gramStart"/>
-      <w:r>
-        <w:t>analys</w:t>
-      </w:r>
-      <w:r>
-        <w:t>es</w:t>
-      </w:r>
-      <w:proofErr w:type="gramEnd"/>
     </w:p>
     <w:p>
       <w:pPr>
@@ -8349,18 +8172,10 @@
         <w:t>s</w:t>
       </w:r>
       <w:r>
-        <w:t xml:space="preserve"> of the Enrollment table of rows where </w:t>
-      </w:r>
-      <w:proofErr w:type="spellStart"/>
-      <w:r>
-        <w:t>MedCo</w:t>
+        <w:t xml:space="preserve"> of the Enrollment table of rows where MedCo</w:t>
       </w:r>
       <w:r>
-        <w:t>v</w:t>
-      </w:r>
-      <w:proofErr w:type="spellEnd"/>
-      <w:r>
-        <w:t xml:space="preserve"> </w:t>
+        <w:t xml:space="preserve">v </w:t>
       </w:r>
       <w:r>
         <w:t>=</w:t>
@@ -8369,13 +8184,8 @@
         <w:t xml:space="preserve"> </w:t>
       </w:r>
       <w:r>
-        <w:t xml:space="preserve">’Y’ and </w:t>
+        <w:t>’Y’ and DrugCov</w:t>
       </w:r>
-      <w:proofErr w:type="spellStart"/>
-      <w:r>
-        <w:t>DrugCov</w:t>
-      </w:r>
-      <w:proofErr w:type="spellEnd"/>
       <w:r>
         <w:t xml:space="preserve"> </w:t>
       </w:r>
@@ -8389,23 +8199,7 @@
         <w:t>’Y’</w:t>
       </w:r>
       <w:r>
-        <w:t xml:space="preserve">, where </w:t>
-      </w:r>
-      <w:proofErr w:type="spellStart"/>
-      <w:r>
-        <w:t>MedCov</w:t>
-      </w:r>
-      <w:proofErr w:type="spellEnd"/>
-      <w:r>
-        <w:t xml:space="preserve"> = ‘Y’, and where </w:t>
-      </w:r>
-      <w:proofErr w:type="spellStart"/>
-      <w:r>
-        <w:t>DrugCov</w:t>
-      </w:r>
-      <w:proofErr w:type="spellEnd"/>
-      <w:r>
-        <w:t xml:space="preserve"> = ‘Y’</w:t>
+        <w:t>, where MedCov = ‘Y’, and where DrugCov = ‘Y’</w:t>
       </w:r>
     </w:p>
     <w:p>
@@ -8424,32 +8218,11 @@
         <w:t xml:space="preserve">as </w:t>
       </w:r>
       <w:r>
-        <w:t>dplocal.enr_final_&amp;</w:t>
-      </w:r>
-      <w:proofErr w:type="spellStart"/>
-      <w:r>
-        <w:t>cov</w:t>
-      </w:r>
-      <w:proofErr w:type="spellEnd"/>
-      <w:r>
-        <w:t>.</w:t>
+        <w:t>dplocal.enr_final_&amp;cov.</w:t>
       </w:r>
       <w:r>
-        <w:t>, where &amp;</w:t>
+        <w:t>, where &amp;cov. is m, d, or md</w:t>
       </w:r>
-      <w:proofErr w:type="spellStart"/>
-      <w:r>
-        <w:t>cov</w:t>
-      </w:r>
-      <w:proofErr w:type="spellEnd"/>
-      <w:r>
-        <w:t xml:space="preserve">. is m, d, or </w:t>
-      </w:r>
-      <w:proofErr w:type="gramStart"/>
-      <w:r>
-        <w:t>md</w:t>
-      </w:r>
-      <w:proofErr w:type="gramEnd"/>
     </w:p>
     <w:p>
       <w:pPr>
@@ -8461,15 +8234,7 @@
         <w:spacing w:after="0"/>
       </w:pPr>
       <w:r>
-        <w:t xml:space="preserve">For each bridged dataset, create a list of unique </w:t>
-      </w:r>
-      <w:proofErr w:type="spellStart"/>
-      <w:r>
-        <w:t>PatIDs</w:t>
-      </w:r>
-      <w:proofErr w:type="spellEnd"/>
-      <w:r>
-        <w:t xml:space="preserve"> and </w:t>
+        <w:t xml:space="preserve">For each bridged dataset, create a list of unique PatIDs and </w:t>
       </w:r>
       <w:r>
         <w:t xml:space="preserve">save as </w:t>
@@ -8477,48 +8242,25 @@
       <w:r>
         <w:t>dplocal.enr_</w:t>
       </w:r>
-      <w:proofErr w:type="spellStart"/>
       <w:r>
         <w:t>patid</w:t>
       </w:r>
-      <w:proofErr w:type="spellEnd"/>
       <w:r>
-        <w:t>_&amp;</w:t>
-      </w:r>
-      <w:proofErr w:type="spellStart"/>
-      <w:r>
-        <w:t>cov</w:t>
-      </w:r>
-      <w:proofErr w:type="spellEnd"/>
-      <w:r>
-        <w:t>.</w:t>
+        <w:t>_&amp;cov.</w:t>
       </w:r>
       <w:r>
-        <w:t>, where &amp;</w:t>
+        <w:t>, where &amp;cov. is m, d, or md</w:t>
       </w:r>
-      <w:proofErr w:type="spellStart"/>
-      <w:r>
-        <w:t>cov</w:t>
-      </w:r>
-      <w:proofErr w:type="spellEnd"/>
-      <w:r>
-        <w:t xml:space="preserve">. is m, d, or </w:t>
-      </w:r>
-      <w:proofErr w:type="gramStart"/>
-      <w:r>
-        <w:t>md</w:t>
-      </w:r>
-      <w:proofErr w:type="gramEnd"/>
     </w:p>
     <w:p>
       <w:pPr>
         <w:pStyle w:val="Heading1"/>
       </w:pPr>
-      <w:bookmarkStart w:id="51" w:name="_Toc176524911"/>
+      <w:bookmarkStart w:id="31" w:name="_Toc176524911"/>
       <w:r>
         <w:t>Master Program Parameters</w:t>
       </w:r>
-      <w:bookmarkEnd w:id="51"/>
+      <w:bookmarkEnd w:id="31"/>
     </w:p>
     <w:p>
       <w:r>
@@ -8533,27 +8275,14 @@
       <w:r>
         <w:t xml:space="preserve">Table </w:t>
       </w:r>
-      <w:r>
-        <w:fldChar w:fldCharType="begin"/>
-      </w:r>
-      <w:r>
-        <w:instrText xml:space="preserve"> SEQ Table \* ARABIC </w:instrText>
-      </w:r>
-      <w:r>
-        <w:fldChar w:fldCharType="separate"/>
-      </w:r>
-      <w:r>
-        <w:rPr>
-          <w:noProof/>
-        </w:rPr>
-        <w:t>1</w:t>
-      </w:r>
-      <w:r>
-        <w:rPr>
-          <w:noProof/>
-        </w:rPr>
-        <w:fldChar w:fldCharType="end"/>
-      </w:r>
+      <w:fldSimple w:instr=" SEQ Table \* ARABIC ">
+        <w:r>
+          <w:rPr>
+            <w:noProof/>
+          </w:rPr>
+          <w:t>1</w:t>
+        </w:r>
+      </w:fldSimple>
       <w:r>
         <w:t>. SCDM Snapshot master program parameter specifications</w:t>
       </w:r>
@@ -8898,7 +8627,6 @@
               </w:rPr>
               <w:t>—</w:t>
             </w:r>
-            <w:proofErr w:type="spellStart"/>
             <w:r>
               <w:rPr>
                 <w:rFonts w:eastAsia="Times New Roman" w:cstheme="minorHAnsi"/>
@@ -8908,7 +8636,6 @@
               </w:rPr>
               <w:t>PatID</w:t>
             </w:r>
-            <w:proofErr w:type="spellEnd"/>
             <w:r>
               <w:rPr>
                 <w:rFonts w:eastAsia="Times New Roman" w:cstheme="minorHAnsi"/>
@@ -8925,27 +8652,7 @@
                 <w:sz w:val="20"/>
                 <w:szCs w:val="20"/>
               </w:rPr>
-              <w:t xml:space="preserve">and list all </w:t>
-            </w:r>
-            <w:proofErr w:type="spellStart"/>
-            <w:r>
-              <w:rPr>
-                <w:rFonts w:eastAsia="Times New Roman" w:cstheme="minorHAnsi"/>
-                <w:color w:val="auto"/>
-                <w:sz w:val="20"/>
-                <w:szCs w:val="20"/>
-              </w:rPr>
-              <w:t>PatID</w:t>
-            </w:r>
-            <w:proofErr w:type="spellEnd"/>
-            <w:r>
-              <w:rPr>
-                <w:rFonts w:eastAsia="Times New Roman" w:cstheme="minorHAnsi"/>
-                <w:color w:val="auto"/>
-                <w:sz w:val="20"/>
-                <w:szCs w:val="20"/>
-              </w:rPr>
-              <w:t xml:space="preserve"> values to exclude from the request.</w:t>
+              <w:t>and list all PatID values to exclude from the request.</w:t>
             </w:r>
             <w:r>
               <w:rPr>
@@ -9012,19 +8719,8 @@
                 <w:sz w:val="20"/>
                 <w:szCs w:val="20"/>
               </w:rPr>
-              <w:t> </w:t>
-            </w:r>
-            <w:proofErr w:type="spellStart"/>
-            <w:r>
-              <w:rPr>
-                <w:rFonts w:eastAsia="Times New Roman" w:cstheme="minorHAnsi"/>
-                <w:color w:val="auto"/>
-                <w:sz w:val="20"/>
-                <w:szCs w:val="20"/>
-              </w:rPr>
-              <w:t>indata.ptstoexclude</w:t>
-            </w:r>
-            <w:proofErr w:type="spellEnd"/>
+              <w:t> indata.ptstoexclude</w:t>
+            </w:r>
           </w:p>
         </w:tc>
       </w:tr>
@@ -9326,7 +9022,6 @@
               </w:rPr>
               <w:t> </w:t>
             </w:r>
-            <w:proofErr w:type="spellStart"/>
             <w:r>
               <w:rPr>
                 <w:rFonts w:eastAsia="Times New Roman" w:cstheme="minorHAnsi"/>
@@ -9336,7 +9031,6 @@
               </w:rPr>
               <w:t>dgr</w:t>
             </w:r>
-            <w:proofErr w:type="spellEnd"/>
           </w:p>
         </w:tc>
       </w:tr>
@@ -9683,27 +9377,7 @@
                 <w:sz w:val="20"/>
                 <w:szCs w:val="20"/>
               </w:rPr>
-              <w:t> if a package is not Data Partner specific, DPID should equal "</w:t>
-            </w:r>
-            <w:proofErr w:type="spellStart"/>
-            <w:r>
-              <w:rPr>
-                <w:rFonts w:eastAsia="Times New Roman" w:cstheme="minorHAnsi"/>
-                <w:color w:val="auto"/>
-                <w:sz w:val="20"/>
-                <w:szCs w:val="20"/>
-              </w:rPr>
-              <w:t>nsdp</w:t>
-            </w:r>
-            <w:proofErr w:type="spellEnd"/>
-            <w:r>
-              <w:rPr>
-                <w:rFonts w:eastAsia="Times New Roman" w:cstheme="minorHAnsi"/>
-                <w:color w:val="auto"/>
-                <w:sz w:val="20"/>
-                <w:szCs w:val="20"/>
-              </w:rPr>
-              <w:t>".</w:t>
+              <w:t> if a package is not Data Partner specific, DPID should equal "nsdp".</w:t>
             </w:r>
             <w:r>
               <w:rPr>
@@ -9770,19 +9444,8 @@
                 <w:sz w:val="20"/>
                 <w:szCs w:val="20"/>
               </w:rPr>
-              <w:t> </w:t>
-            </w:r>
-            <w:proofErr w:type="spellStart"/>
-            <w:r>
-              <w:rPr>
-                <w:rFonts w:eastAsia="Times New Roman" w:cstheme="minorHAnsi"/>
-                <w:color w:val="auto"/>
-                <w:sz w:val="20"/>
-                <w:szCs w:val="20"/>
-              </w:rPr>
-              <w:t>nsdp</w:t>
-            </w:r>
-            <w:proofErr w:type="spellEnd"/>
+              <w:t> nsdp</w:t>
+            </w:r>
           </w:p>
         </w:tc>
       </w:tr>
@@ -10011,22 +9674,21 @@
       <w:pPr>
         <w:pStyle w:val="Heading1"/>
       </w:pPr>
-      <w:bookmarkStart w:id="52" w:name="_Toc176524912"/>
+      <w:bookmarkStart w:id="32" w:name="_Toc176524912"/>
       <w:r>
         <w:lastRenderedPageBreak/>
         <w:t>Output</w:t>
       </w:r>
-      <w:bookmarkEnd w:id="52"/>
+      <w:bookmarkEnd w:id="32"/>
     </w:p>
     <w:p>
       <w:pPr>
         <w:pStyle w:val="Heading2"/>
       </w:pPr>
-      <w:bookmarkStart w:id="53" w:name="_Ref469061835"/>
-      <w:bookmarkStart w:id="54" w:name="_Toc32229616"/>
-      <w:bookmarkStart w:id="55" w:name="_Ref456940949"/>
-      <w:bookmarkStart w:id="56" w:name="_Toc176524913"/>
-      <w:proofErr w:type="spellStart"/>
+      <w:bookmarkStart w:id="33" w:name="_Ref469061835"/>
+      <w:bookmarkStart w:id="34" w:name="_Toc32229616"/>
+      <w:bookmarkStart w:id="35" w:name="_Toc176524913"/>
+      <w:bookmarkStart w:id="36" w:name="_Ref456940949"/>
       <w:r>
         <w:t>enr_</w:t>
       </w:r>
@@ -10036,10 +9698,9 @@
       <w:r>
         <w:t>_covlength_md</w:t>
       </w:r>
-      <w:bookmarkEnd w:id="53"/>
-      <w:bookmarkEnd w:id="54"/>
-      <w:bookmarkEnd w:id="56"/>
-      <w:proofErr w:type="spellEnd"/>
+      <w:bookmarkEnd w:id="33"/>
+      <w:bookmarkEnd w:id="34"/>
+      <w:bookmarkEnd w:id="35"/>
     </w:p>
     <w:p>
       <w:pPr>
@@ -10050,7 +9711,7 @@
           <w:szCs w:val="24"/>
         </w:rPr>
       </w:pPr>
-      <w:bookmarkStart w:id="57" w:name="_Toc176524914"/>
+      <w:bookmarkStart w:id="37" w:name="_Toc176524914"/>
       <w:r>
         <w:rPr>
           <w:rFonts w:asciiTheme="majorHAnsi" w:eastAsiaTheme="majorEastAsia" w:hAnsiTheme="majorHAnsi" w:cstheme="majorBidi"/>
@@ -10060,7 +9721,7 @@
         </w:rPr>
         <w:t>Description</w:t>
       </w:r>
-      <w:bookmarkEnd w:id="57"/>
+      <w:bookmarkEnd w:id="37"/>
     </w:p>
     <w:p>
       <w:r>
@@ -10551,7 +10212,6 @@
               </w:rPr>
               <w:t>LOE=</w:t>
             </w:r>
-            <w:proofErr w:type="spellStart"/>
             <w:r>
               <w:rPr>
                 <w:i/>
@@ -10560,7 +10220,6 @@
               </w:rPr>
               <w:t>Enrollment.Enr_End</w:t>
             </w:r>
-            <w:proofErr w:type="spellEnd"/>
             <w:r>
               <w:rPr>
                 <w:color w:val="auto"/>
@@ -10568,7 +10227,6 @@
               </w:rPr>
               <w:t xml:space="preserve"> – </w:t>
             </w:r>
-            <w:proofErr w:type="spellStart"/>
             <w:r>
               <w:rPr>
                 <w:i/>
@@ -10577,7 +10235,6 @@
               </w:rPr>
               <w:t>Enrollment.Enr_Start</w:t>
             </w:r>
-            <w:proofErr w:type="spellEnd"/>
             <w:r>
               <w:rPr>
                 <w:color w:val="auto"/>
@@ -11460,16 +11117,14 @@
       <w:pPr>
         <w:pStyle w:val="Heading2"/>
       </w:pPr>
-      <w:bookmarkStart w:id="58" w:name="_Toc32229617"/>
-      <w:bookmarkStart w:id="59" w:name="_Toc176524915"/>
-      <w:bookmarkEnd w:id="55"/>
-      <w:proofErr w:type="spellStart"/>
+      <w:bookmarkStart w:id="38" w:name="_Toc32229617"/>
+      <w:bookmarkStart w:id="39" w:name="_Toc176524915"/>
+      <w:bookmarkEnd w:id="36"/>
       <w:r>
         <w:t>enr_pat_covlength_md</w:t>
       </w:r>
-      <w:bookmarkEnd w:id="58"/>
-      <w:bookmarkEnd w:id="59"/>
-      <w:proofErr w:type="spellEnd"/>
+      <w:bookmarkEnd w:id="38"/>
+      <w:bookmarkEnd w:id="39"/>
     </w:p>
     <w:p>
       <w:pPr>
@@ -11480,7 +11135,7 @@
           <w:szCs w:val="24"/>
         </w:rPr>
       </w:pPr>
-      <w:bookmarkStart w:id="60" w:name="_Toc176524916"/>
+      <w:bookmarkStart w:id="40" w:name="_Toc176524916"/>
       <w:r>
         <w:rPr>
           <w:rFonts w:asciiTheme="majorHAnsi" w:eastAsiaTheme="majorEastAsia" w:hAnsiTheme="majorHAnsi" w:cstheme="majorBidi"/>
@@ -11490,19 +11145,11 @@
         </w:rPr>
         <w:t>Description</w:t>
       </w:r>
-      <w:bookmarkEnd w:id="60"/>
+      <w:bookmarkEnd w:id="40"/>
     </w:p>
     <w:p>
       <w:r>
-        <w:t xml:space="preserve">Frequency of total length of enrollment span in days by unique </w:t>
-      </w:r>
-      <w:proofErr w:type="spellStart"/>
-      <w:r>
-        <w:t>PatID</w:t>
-      </w:r>
-      <w:proofErr w:type="spellEnd"/>
-      <w:r>
-        <w:t>. </w:t>
+        <w:t>Frequency of total length of enrollment span in days by unique PatID. </w:t>
       </w:r>
     </w:p>
     <w:p>
@@ -11865,7 +11512,6 @@
                 <w:szCs w:val="20"/>
               </w:rPr>
             </w:pPr>
-            <w:proofErr w:type="spellStart"/>
             <w:r>
               <w:rPr>
                 <w:rFonts w:cs="Arial"/>
@@ -11876,7 +11522,6 @@
               <w:lastRenderedPageBreak/>
               <w:t>tLOE</w:t>
             </w:r>
-            <w:proofErr w:type="spellEnd"/>
           </w:p>
         </w:tc>
         <w:tc>
@@ -11982,23 +11627,13 @@
                 <w:sz w:val="20"/>
               </w:rPr>
             </w:pPr>
-            <w:proofErr w:type="spellStart"/>
-            <w:r>
-              <w:rPr>
-                <w:color w:val="auto"/>
-                <w:sz w:val="20"/>
-              </w:rPr>
-              <w:t>tLOE</w:t>
-            </w:r>
-            <w:proofErr w:type="spellEnd"/>
-            <w:r>
-              <w:rPr>
-                <w:color w:val="auto"/>
-                <w:sz w:val="20"/>
-              </w:rPr>
-              <w:t>=sum(</w:t>
-            </w:r>
-            <w:proofErr w:type="spellStart"/>
+            <w:r>
+              <w:rPr>
+                <w:color w:val="auto"/>
+                <w:sz w:val="20"/>
+              </w:rPr>
+              <w:t>tLOE=sum(</w:t>
+            </w:r>
             <w:r>
               <w:rPr>
                 <w:i/>
@@ -12007,7 +11642,6 @@
               </w:rPr>
               <w:t>Enrollment.Enr_End</w:t>
             </w:r>
-            <w:proofErr w:type="spellEnd"/>
             <w:r>
               <w:rPr>
                 <w:color w:val="auto"/>
@@ -12015,7 +11649,6 @@
               </w:rPr>
               <w:t xml:space="preserve"> – </w:t>
             </w:r>
-            <w:proofErr w:type="spellStart"/>
             <w:r>
               <w:rPr>
                 <w:i/>
@@ -12024,7 +11657,6 @@
               </w:rPr>
               <w:t>Enrollment.Enr_Start</w:t>
             </w:r>
-            <w:proofErr w:type="spellEnd"/>
             <w:r>
               <w:rPr>
                 <w:color w:val="auto"/>
@@ -12032,31 +11664,50 @@
               </w:rPr>
               <w:t xml:space="preserve"> +1) per unique </w:t>
             </w:r>
-            <w:proofErr w:type="spellStart"/>
             <w:r>
               <w:rPr>
                 <w:i/>
                 <w:color w:val="auto"/>
                 <w:sz w:val="20"/>
               </w:rPr>
-              <w:t>Enrollment.Patid</w:t>
-            </w:r>
-            <w:proofErr w:type="spellEnd"/>
+              <w:t xml:space="preserve">Enrollment.Patid </w:t>
+            </w:r>
+            <w:r>
+              <w:rPr>
+                <w:color w:val="auto"/>
+                <w:sz w:val="20"/>
+              </w:rPr>
+              <w:t>where</w:t>
+            </w:r>
             <w:r>
               <w:rPr>
                 <w:i/>
                 <w:color w:val="auto"/>
                 <w:sz w:val="20"/>
               </w:rPr>
+              <w:t>Enrolllment.MedCov</w:t>
+            </w:r>
+            <w:r>
+              <w:rPr>
+                <w:color w:val="auto"/>
+                <w:sz w:val="20"/>
+              </w:rPr>
+              <w:t>=’Y’</w:t>
+            </w:r>
+            <w:r>
+              <w:rPr>
+                <w:i/>
+                <w:color w:val="auto"/>
+                <w:sz w:val="20"/>
+              </w:rPr>
               <w:t xml:space="preserve"> </w:t>
             </w:r>
-            <w:proofErr w:type="spellStart"/>
-            <w:r>
-              <w:rPr>
-                <w:color w:val="auto"/>
-                <w:sz w:val="20"/>
-              </w:rPr>
-              <w:t>where</w:t>
+            <w:r>
+              <w:rPr>
+                <w:color w:val="auto"/>
+                <w:sz w:val="20"/>
+              </w:rPr>
+              <w:t xml:space="preserve">and </w:t>
             </w:r>
             <w:r>
               <w:rPr>
@@ -12064,41 +11715,8 @@
                 <w:color w:val="auto"/>
                 <w:sz w:val="20"/>
               </w:rPr>
-              <w:t>Enrolllment.MedCov</w:t>
-            </w:r>
-            <w:proofErr w:type="spellEnd"/>
-            <w:r>
-              <w:rPr>
-                <w:color w:val="auto"/>
-                <w:sz w:val="20"/>
-              </w:rPr>
-              <w:t>=’Y’</w:t>
-            </w:r>
-            <w:r>
-              <w:rPr>
-                <w:i/>
-                <w:color w:val="auto"/>
-                <w:sz w:val="20"/>
-              </w:rPr>
-              <w:t xml:space="preserve"> </w:t>
-            </w:r>
-            <w:r>
-              <w:rPr>
-                <w:color w:val="auto"/>
-                <w:sz w:val="20"/>
-              </w:rPr>
-              <w:t xml:space="preserve">and </w:t>
-            </w:r>
-            <w:proofErr w:type="spellStart"/>
-            <w:r>
-              <w:rPr>
-                <w:i/>
-                <w:color w:val="auto"/>
-                <w:sz w:val="20"/>
-              </w:rPr>
               <w:t>Enrollment.DrugCov</w:t>
             </w:r>
-            <w:proofErr w:type="spellEnd"/>
             <w:r>
               <w:rPr>
                 <w:color w:val="auto"/>
@@ -12254,7 +11872,6 @@
               </w:rPr>
               <w:t xml:space="preserve">Count of unique </w:t>
             </w:r>
-            <w:proofErr w:type="spellStart"/>
             <w:r>
               <w:rPr>
                 <w:i/>
@@ -12263,23 +11880,13 @@
               </w:rPr>
               <w:t>Enrollment.PatID</w:t>
             </w:r>
-            <w:proofErr w:type="spellEnd"/>
-            <w:r>
-              <w:rPr>
-                <w:color w:val="auto"/>
-                <w:sz w:val="20"/>
-              </w:rPr>
-              <w:t xml:space="preserve"> per </w:t>
-            </w:r>
-            <w:proofErr w:type="spellStart"/>
-            <w:r>
-              <w:rPr>
-                <w:color w:val="auto"/>
-                <w:sz w:val="20"/>
-              </w:rPr>
-              <w:t>tLOE</w:t>
-            </w:r>
-            <w:proofErr w:type="spellEnd"/>
+            <w:r>
+              <w:rPr>
+                <w:color w:val="auto"/>
+                <w:sz w:val="20"/>
+              </w:rPr>
+              <w:t xml:space="preserve"> per tLOE</w:t>
+            </w:r>
           </w:p>
         </w:tc>
       </w:tr>
@@ -12873,15 +12480,13 @@
       <w:pPr>
         <w:pStyle w:val="Heading2"/>
       </w:pPr>
-      <w:bookmarkStart w:id="61" w:name="_Ref469062194"/>
-      <w:bookmarkStart w:id="62" w:name="_Toc32229618"/>
-      <w:bookmarkStart w:id="63" w:name="_Toc176524917"/>
-      <w:proofErr w:type="spellStart"/>
+      <w:bookmarkStart w:id="41" w:name="_Toc176524917"/>
+      <w:bookmarkStart w:id="42" w:name="_Ref469062194"/>
+      <w:bookmarkStart w:id="43" w:name="_Toc32229618"/>
       <w:r>
         <w:t>enr_patid_ct_md_y</w:t>
       </w:r>
-      <w:bookmarkEnd w:id="63"/>
-      <w:proofErr w:type="spellEnd"/>
+      <w:bookmarkEnd w:id="41"/>
     </w:p>
     <w:p>
       <w:pPr>
@@ -12906,16 +12511,11 @@
       <w:r>
         <w:t xml:space="preserve">Number of </w:t>
       </w:r>
-      <w:proofErr w:type="spellStart"/>
       <w:r>
         <w:t>P</w:t>
       </w:r>
       <w:r>
-        <w:t>atIDs</w:t>
-      </w:r>
-      <w:proofErr w:type="spellEnd"/>
-      <w:r>
-        <w:t xml:space="preserve"> with at least one day of medical and drug coverag</w:t>
+        <w:t>atIDs with at least one day of medical and drug coverag</w:t>
       </w:r>
       <w:r>
         <w:t>e by year.</w:t>
@@ -13393,31 +12993,13 @@
                 <w:sz w:val="20"/>
               </w:rPr>
             </w:pPr>
-            <w:proofErr w:type="spellStart"/>
-            <w:r>
-              <w:rPr>
-                <w:color w:val="auto"/>
-                <w:sz w:val="20"/>
-              </w:rPr>
-              <w:t>ENR.enr_start</w:t>
-            </w:r>
-            <w:proofErr w:type="spellEnd"/>
-            <w:r>
-              <w:rPr>
-                <w:color w:val="auto"/>
-                <w:sz w:val="20"/>
-              </w:rPr>
-              <w:t xml:space="preserve">, </w:t>
-            </w:r>
-            <w:proofErr w:type="spellStart"/>
-            <w:r>
-              <w:rPr>
-                <w:color w:val="auto"/>
-                <w:sz w:val="20"/>
-              </w:rPr>
-              <w:t>Enr.enr_end</w:t>
-            </w:r>
-            <w:proofErr w:type="spellEnd"/>
+            <w:r>
+              <w:rPr>
+                <w:color w:val="auto"/>
+                <w:sz w:val="20"/>
+              </w:rPr>
+              <w:t>ENR.enr_start, Enr.enr_end</w:t>
+            </w:r>
           </w:p>
         </w:tc>
       </w:tr>
@@ -13533,7 +13115,6 @@
                 <w:szCs w:val="20"/>
               </w:rPr>
             </w:pPr>
-            <w:proofErr w:type="spellStart"/>
             <w:r>
               <w:rPr>
                 <w:rFonts w:cs="Arial"/>
@@ -13543,7 +13124,6 @@
               </w:rPr>
               <w:t>PatID</w:t>
             </w:r>
-            <w:proofErr w:type="spellEnd"/>
             <w:r>
               <w:rPr>
                 <w:rFonts w:cs="Arial"/>
@@ -13611,17 +13191,8 @@
                 <w:color w:val="auto"/>
                 <w:sz w:val="20"/>
               </w:rPr>
-              <w:t xml:space="preserve">Count of unique </w:t>
-            </w:r>
-            <w:proofErr w:type="spellStart"/>
-            <w:r>
-              <w:rPr>
-                <w:color w:val="auto"/>
-                <w:sz w:val="20"/>
-              </w:rPr>
-              <w:t>PatID</w:t>
-            </w:r>
-            <w:proofErr w:type="spellEnd"/>
+              <w:t>Count of unique PatID</w:t>
+            </w:r>
             <w:r>
               <w:rPr>
                 <w:color w:val="auto"/>
@@ -13738,7 +13309,6 @@
                 <w:szCs w:val="20"/>
               </w:rPr>
             </w:pPr>
-            <w:proofErr w:type="spellStart"/>
             <w:r>
               <w:rPr>
                 <w:rFonts w:cs="Arial"/>
@@ -13748,7 +13318,6 @@
               </w:rPr>
               <w:t>PatID</w:t>
             </w:r>
-            <w:proofErr w:type="spellEnd"/>
             <w:r>
               <w:rPr>
                 <w:rFonts w:cs="Arial"/>
@@ -14107,13 +13676,11 @@
       <w:pPr>
         <w:pStyle w:val="Heading2"/>
       </w:pPr>
-      <w:bookmarkStart w:id="64" w:name="_Toc176524918"/>
-      <w:proofErr w:type="spellStart"/>
+      <w:bookmarkStart w:id="44" w:name="_Toc176524918"/>
       <w:r>
         <w:t>enr_patid_ct_md</w:t>
       </w:r>
-      <w:bookmarkEnd w:id="64"/>
-      <w:proofErr w:type="spellEnd"/>
+      <w:bookmarkEnd w:id="44"/>
     </w:p>
     <w:p>
       <w:pPr>
@@ -14139,16 +13706,11 @@
         <w:lastRenderedPageBreak/>
         <w:t xml:space="preserve">Number of </w:t>
       </w:r>
-      <w:proofErr w:type="spellStart"/>
       <w:r>
         <w:t>P</w:t>
       </w:r>
       <w:r>
-        <w:t>atIDs</w:t>
-      </w:r>
-      <w:proofErr w:type="spellEnd"/>
-      <w:r>
-        <w:t xml:space="preserve"> with at least one day of medical and drug coverag</w:t>
+        <w:t>atIDs with at least one day of medical and drug coverag</w:t>
       </w:r>
       <w:r>
         <w:t>e.</w:t>
@@ -14615,19 +14177,8 @@
                 <w:sz w:val="20"/>
                 <w:szCs w:val="20"/>
               </w:rPr>
-              <w:t xml:space="preserve">Total </w:t>
-            </w:r>
-            <w:proofErr w:type="spellStart"/>
-            <w:r>
-              <w:rPr>
-                <w:rFonts w:cs="Arial"/>
-                <w:color w:val="000000"/>
-                <w:sz w:val="20"/>
-                <w:szCs w:val="20"/>
-              </w:rPr>
-              <w:t>PatID</w:t>
-            </w:r>
-            <w:proofErr w:type="spellEnd"/>
+              <w:t>Total PatID</w:t>
+            </w:r>
             <w:r>
               <w:rPr>
                 <w:rFonts w:cs="Arial"/>
@@ -14677,17 +14228,8 @@
                 <w:color w:val="auto"/>
                 <w:sz w:val="20"/>
               </w:rPr>
-              <w:t xml:space="preserve">Count of unique </w:t>
-            </w:r>
-            <w:proofErr w:type="spellStart"/>
-            <w:r>
-              <w:rPr>
-                <w:color w:val="auto"/>
-                <w:sz w:val="20"/>
-              </w:rPr>
-              <w:t>PatID</w:t>
-            </w:r>
-            <w:proofErr w:type="spellEnd"/>
+              <w:t>Count of unique PatID</w:t>
+            </w:r>
           </w:p>
         </w:tc>
       </w:tr>
@@ -14777,19 +14319,8 @@
                 <w:sz w:val="20"/>
                 <w:szCs w:val="20"/>
               </w:rPr>
-              <w:t xml:space="preserve">Total </w:t>
-            </w:r>
-            <w:proofErr w:type="spellStart"/>
-            <w:r>
-              <w:rPr>
-                <w:rFonts w:cs="Arial"/>
-                <w:color w:val="000000"/>
-                <w:sz w:val="20"/>
-                <w:szCs w:val="20"/>
-              </w:rPr>
-              <w:t>PatID</w:t>
-            </w:r>
-            <w:proofErr w:type="spellEnd"/>
+              <w:t>Total PatID</w:t>
+            </w:r>
             <w:r>
               <w:rPr>
                 <w:rFonts w:cs="Arial"/>
@@ -14865,15 +14396,13 @@
       <w:pPr>
         <w:pStyle w:val="Heading2"/>
       </w:pPr>
-      <w:bookmarkStart w:id="65" w:name="_Toc176524920"/>
-      <w:proofErr w:type="spellStart"/>
+      <w:bookmarkStart w:id="45" w:name="_Toc176524920"/>
       <w:r>
         <w:t>enr_active_patid_ct_md</w:t>
       </w:r>
-      <w:bookmarkEnd w:id="61"/>
-      <w:bookmarkEnd w:id="62"/>
-      <w:bookmarkEnd w:id="65"/>
-      <w:proofErr w:type="spellEnd"/>
+      <w:bookmarkEnd w:id="42"/>
+      <w:bookmarkEnd w:id="43"/>
+      <w:bookmarkEnd w:id="45"/>
     </w:p>
     <w:p>
       <w:pPr>
@@ -14884,7 +14413,7 @@
           <w:szCs w:val="24"/>
         </w:rPr>
       </w:pPr>
-      <w:bookmarkStart w:id="66" w:name="_Toc176524921"/>
+      <w:bookmarkStart w:id="46" w:name="_Toc176524921"/>
       <w:r>
         <w:rPr>
           <w:rFonts w:asciiTheme="majorHAnsi" w:eastAsiaTheme="majorEastAsia" w:hAnsiTheme="majorHAnsi" w:cstheme="majorBidi"/>
@@ -14894,7 +14423,7 @@
         </w:rPr>
         <w:t>Description</w:t>
       </w:r>
-      <w:bookmarkEnd w:id="66"/>
+      <w:bookmarkEnd w:id="46"/>
     </w:p>
     <w:p>
       <w:pPr>
@@ -14903,15 +14432,7 @@
         </w:rPr>
       </w:pPr>
       <w:r>
-        <w:t>Number of actively enrolled patients as of a Data Partner’s overall maximum date for data completeness (</w:t>
-      </w:r>
-      <w:proofErr w:type="spellStart"/>
-      <w:r>
-        <w:t>DP_MaxDate</w:t>
-      </w:r>
-      <w:proofErr w:type="spellEnd"/>
-      <w:r>
-        <w:t>)</w:t>
+        <w:t>Number of actively enrolled patients as of a Data Partner’s overall maximum date for data completeness (DP_MaxDate)</w:t>
       </w:r>
       <w:r>
         <w:rPr>
@@ -15280,7 +14801,6 @@
                 <w:szCs w:val="20"/>
               </w:rPr>
             </w:pPr>
-            <w:proofErr w:type="spellStart"/>
             <w:r>
               <w:rPr>
                 <w:rFonts w:cs="Arial"/>
@@ -15290,7 +14810,6 @@
               </w:rPr>
               <w:t>DP_MaxDate</w:t>
             </w:r>
-            <w:proofErr w:type="spellEnd"/>
           </w:p>
         </w:tc>
         <w:tc>
@@ -15399,23 +14918,7 @@
                 <w:color w:val="auto"/>
                 <w:sz w:val="20"/>
               </w:rPr>
-              <w:t>Based on macro variable &amp;</w:t>
-            </w:r>
-            <w:proofErr w:type="spellStart"/>
-            <w:r>
-              <w:rPr>
-                <w:color w:val="auto"/>
-                <w:sz w:val="20"/>
-              </w:rPr>
-              <w:t>dp_maxdate</w:t>
-            </w:r>
-            <w:proofErr w:type="spellEnd"/>
-            <w:r>
-              <w:rPr>
-                <w:color w:val="auto"/>
-                <w:sz w:val="20"/>
-              </w:rPr>
-              <w:t xml:space="preserve"> (created by common components)</w:t>
+              <w:t>Based on macro variable &amp;dp_maxdate (created by common components)</w:t>
             </w:r>
           </w:p>
         </w:tc>
@@ -15563,25 +15066,8 @@
                 <w:color w:val="auto"/>
                 <w:sz w:val="20"/>
               </w:rPr>
-              <w:t xml:space="preserve">Count of unique </w:t>
-            </w:r>
-            <w:proofErr w:type="spellStart"/>
-            <w:r>
-              <w:rPr>
-                <w:color w:val="auto"/>
-                <w:sz w:val="20"/>
-              </w:rPr>
-              <w:t>PatID</w:t>
-            </w:r>
-            <w:proofErr w:type="spellEnd"/>
-            <w:r>
-              <w:rPr>
-                <w:color w:val="auto"/>
-                <w:sz w:val="20"/>
-              </w:rPr>
-              <w:t xml:space="preserve"> where last </w:t>
-            </w:r>
-            <w:proofErr w:type="spellStart"/>
+              <w:t xml:space="preserve">Count of unique PatID where last </w:t>
+            </w:r>
             <w:r>
               <w:rPr>
                 <w:i/>
@@ -15590,39 +15076,13 @@
               </w:rPr>
               <w:t>enrollment.Enr_End</w:t>
             </w:r>
-            <w:proofErr w:type="spellEnd"/>
-            <w:r>
-              <w:rPr>
-                <w:color w:val="auto"/>
-                <w:sz w:val="20"/>
-              </w:rPr>
-              <w:t xml:space="preserve"> </w:t>
-            </w:r>
-            <w:proofErr w:type="spellStart"/>
-            <w:r>
-              <w:rPr>
-                <w:color w:val="auto"/>
-                <w:sz w:val="20"/>
-              </w:rPr>
-              <w:t>ge</w:t>
-            </w:r>
-            <w:proofErr w:type="spellEnd"/>
-            <w:r>
-              <w:rPr>
-                <w:color w:val="auto"/>
-                <w:sz w:val="20"/>
-              </w:rPr>
-              <w:t xml:space="preserve"> </w:t>
-            </w:r>
-            <w:proofErr w:type="spellStart"/>
-            <w:r>
-              <w:rPr>
-                <w:color w:val="auto"/>
-                <w:sz w:val="20"/>
-              </w:rPr>
-              <w:t>DP_MaxDate</w:t>
-            </w:r>
-            <w:proofErr w:type="spellEnd"/>
+            <w:r>
+              <w:rPr>
+                <w:color w:val="auto"/>
+                <w:sz w:val="20"/>
+              </w:rPr>
+              <w:t xml:space="preserve"> ge DP_MaxDate</w:t>
+            </w:r>
           </w:p>
         </w:tc>
       </w:tr>
@@ -15707,7 +15167,6 @@
                 <w:szCs w:val="20"/>
               </w:rPr>
             </w:pPr>
-            <w:proofErr w:type="spellStart"/>
             <w:r>
               <w:rPr>
                 <w:rFonts w:cs="Arial"/>
@@ -15717,7 +15176,6 @@
               </w:rPr>
               <w:t>DP_MaxDate</w:t>
             </w:r>
-            <w:proofErr w:type="spellEnd"/>
           </w:p>
         </w:tc>
         <w:tc>
@@ -15842,9 +15300,8 @@
       <w:pPr>
         <w:pStyle w:val="Heading2"/>
       </w:pPr>
-      <w:bookmarkStart w:id="67" w:name="_Toc32229619"/>
-      <w:bookmarkStart w:id="68" w:name="_Toc176524922"/>
-      <w:proofErr w:type="spellStart"/>
+      <w:bookmarkStart w:id="47" w:name="_Toc32229619"/>
+      <w:bookmarkStart w:id="48" w:name="_Toc176524922"/>
       <w:r>
         <w:t>dem_pat_</w:t>
       </w:r>
@@ -15854,9 +15311,8 @@
       <w:r>
         <w:t>agecount_md</w:t>
       </w:r>
-      <w:bookmarkEnd w:id="67"/>
-      <w:bookmarkEnd w:id="68"/>
-      <w:proofErr w:type="spellEnd"/>
+      <w:bookmarkEnd w:id="47"/>
+      <w:bookmarkEnd w:id="48"/>
     </w:p>
     <w:p>
       <w:pPr>
@@ -15867,7 +15323,7 @@
           <w:szCs w:val="24"/>
         </w:rPr>
       </w:pPr>
-      <w:bookmarkStart w:id="69" w:name="_Toc176524923"/>
+      <w:bookmarkStart w:id="49" w:name="_Toc176524923"/>
       <w:r>
         <w:rPr>
           <w:rFonts w:asciiTheme="majorHAnsi" w:eastAsiaTheme="majorEastAsia" w:hAnsiTheme="majorHAnsi" w:cstheme="majorBidi"/>
@@ -15877,22 +15333,17 @@
         </w:rPr>
         <w:t>Description</w:t>
       </w:r>
-      <w:bookmarkEnd w:id="69"/>
+      <w:bookmarkEnd w:id="49"/>
     </w:p>
     <w:p>
       <w:r>
         <w:t xml:space="preserve">Age distribution of all </w:t>
       </w:r>
-      <w:proofErr w:type="spellStart"/>
       <w:r>
         <w:t>Pat</w:t>
       </w:r>
       <w:r>
-        <w:t>IDs</w:t>
-      </w:r>
-      <w:proofErr w:type="spellEnd"/>
-      <w:r>
-        <w:t xml:space="preserve"> with at least one day of medical and drug coverage. Age reflective of the member's first day of enrollment of </w:t>
+        <w:t xml:space="preserve">IDs with at least one day of medical and drug coverage. Age reflective of the member's first day of enrollment of </w:t>
       </w:r>
       <w:r>
         <w:t>most recent</w:t>
@@ -16272,7 +15723,6 @@
                 <w:szCs w:val="20"/>
               </w:rPr>
             </w:pPr>
-            <w:proofErr w:type="spellStart"/>
             <w:r>
               <w:rPr>
                 <w:rFonts w:cs="Arial"/>
@@ -16282,7 +15732,6 @@
               </w:rPr>
               <w:t>SortOrder</w:t>
             </w:r>
-            <w:proofErr w:type="spellEnd"/>
           </w:p>
         </w:tc>
         <w:tc>
@@ -16418,7 +15867,6 @@
                 <w:szCs w:val="20"/>
               </w:rPr>
             </w:pPr>
-            <w:proofErr w:type="spellStart"/>
             <w:r>
               <w:rPr>
                 <w:rFonts w:cs="Arial"/>
@@ -16428,7 +15876,6 @@
               </w:rPr>
               <w:t>Age_Category</w:t>
             </w:r>
-            <w:proofErr w:type="spellEnd"/>
           </w:p>
         </w:tc>
         <w:tc>
@@ -16693,23 +16140,7 @@
                 <w:color w:val="auto"/>
                 <w:sz w:val="20"/>
               </w:rPr>
-              <w:t xml:space="preserve">Count of unique </w:t>
-            </w:r>
-            <w:proofErr w:type="spellStart"/>
-            <w:r>
-              <w:rPr>
-                <w:color w:val="auto"/>
-                <w:sz w:val="20"/>
-              </w:rPr>
-              <w:t>PatID</w:t>
-            </w:r>
-            <w:proofErr w:type="spellEnd"/>
-            <w:r>
-              <w:rPr>
-                <w:color w:val="auto"/>
-                <w:sz w:val="20"/>
-              </w:rPr>
-              <w:t xml:space="preserve"> </w:t>
+              <w:t xml:space="preserve">Count of unique PatID </w:t>
             </w:r>
           </w:p>
         </w:tc>
@@ -16800,7 +16231,6 @@
                 <w:szCs w:val="20"/>
               </w:rPr>
             </w:pPr>
-            <w:proofErr w:type="spellStart"/>
             <w:r>
               <w:rPr>
                 <w:rFonts w:cs="Arial"/>
@@ -16810,7 +16240,6 @@
               </w:rPr>
               <w:t>SortOrder</w:t>
             </w:r>
-            <w:proofErr w:type="spellEnd"/>
           </w:p>
         </w:tc>
         <w:tc>
@@ -17337,8 +16766,7 @@
       <w:pPr>
         <w:pStyle w:val="Heading2"/>
       </w:pPr>
-      <w:bookmarkStart w:id="70" w:name="_Toc176524924"/>
-      <w:proofErr w:type="spellStart"/>
+      <w:bookmarkStart w:id="50" w:name="_Toc176524924"/>
       <w:r>
         <w:t>dem_pat_</w:t>
       </w:r>
@@ -17348,8 +16776,7 @@
       <w:r>
         <w:t>agecount_md</w:t>
       </w:r>
-      <w:bookmarkEnd w:id="70"/>
-      <w:proofErr w:type="spellEnd"/>
+      <w:bookmarkEnd w:id="50"/>
     </w:p>
     <w:p>
       <w:pPr>
@@ -17360,7 +16787,7 @@
           <w:szCs w:val="24"/>
         </w:rPr>
       </w:pPr>
-      <w:bookmarkStart w:id="71" w:name="_Toc176524925"/>
+      <w:bookmarkStart w:id="51" w:name="_Toc176524925"/>
       <w:r>
         <w:rPr>
           <w:rFonts w:asciiTheme="majorHAnsi" w:eastAsiaTheme="majorEastAsia" w:hAnsiTheme="majorHAnsi" w:cstheme="majorBidi"/>
@@ -17370,7 +16797,7 @@
         </w:rPr>
         <w:t>Description</w:t>
       </w:r>
-      <w:bookmarkEnd w:id="71"/>
+      <w:bookmarkEnd w:id="51"/>
     </w:p>
     <w:p>
       <w:r>
@@ -17382,16 +16809,11 @@
       <w:r>
         <w:t xml:space="preserve"> </w:t>
       </w:r>
-      <w:proofErr w:type="spellStart"/>
       <w:r>
         <w:t>Pat</w:t>
       </w:r>
       <w:r>
-        <w:t>IDs</w:t>
-      </w:r>
-      <w:proofErr w:type="spellEnd"/>
-      <w:r>
-        <w:t xml:space="preserve"> with at least one day of medical and drug coverage. Age reflective of the member's first day of enrollment</w:t>
+        <w:t>IDs with at least one day of medical and drug coverage. Age reflective of the member's first day of enrollment</w:t>
       </w:r>
       <w:r>
         <w:t xml:space="preserve"> based on their</w:t>
@@ -17773,7 +17195,6 @@
                 <w:szCs w:val="20"/>
               </w:rPr>
             </w:pPr>
-            <w:proofErr w:type="spellStart"/>
             <w:r>
               <w:rPr>
                 <w:rFonts w:cs="Arial"/>
@@ -17783,7 +17204,6 @@
               </w:rPr>
               <w:t>SortOrder</w:t>
             </w:r>
-            <w:proofErr w:type="spellEnd"/>
           </w:p>
         </w:tc>
         <w:tc>
@@ -17919,7 +17339,6 @@
                 <w:szCs w:val="20"/>
               </w:rPr>
             </w:pPr>
-            <w:proofErr w:type="spellStart"/>
             <w:r>
               <w:rPr>
                 <w:rFonts w:cs="Arial"/>
@@ -17929,7 +17348,6 @@
               </w:rPr>
               <w:t>Age_Category</w:t>
             </w:r>
-            <w:proofErr w:type="spellEnd"/>
           </w:p>
         </w:tc>
         <w:tc>
@@ -18203,23 +17621,7 @@
                 <w:color w:val="auto"/>
                 <w:sz w:val="20"/>
               </w:rPr>
-              <w:t xml:space="preserve">Count of unique </w:t>
-            </w:r>
-            <w:proofErr w:type="spellStart"/>
-            <w:r>
-              <w:rPr>
-                <w:color w:val="auto"/>
-                <w:sz w:val="20"/>
-              </w:rPr>
-              <w:t>PatID</w:t>
-            </w:r>
-            <w:proofErr w:type="spellEnd"/>
-            <w:r>
-              <w:rPr>
-                <w:color w:val="auto"/>
-                <w:sz w:val="20"/>
-              </w:rPr>
-              <w:t xml:space="preserve"> </w:t>
+              <w:t xml:space="preserve">Count of unique PatID </w:t>
             </w:r>
             <w:r>
               <w:rPr>
@@ -18228,7 +17630,6 @@
               </w:rPr>
               <w:t xml:space="preserve">where last </w:t>
             </w:r>
-            <w:proofErr w:type="spellStart"/>
             <w:r>
               <w:rPr>
                 <w:i/>
@@ -18237,39 +17638,13 @@
               </w:rPr>
               <w:t>enrollment.Enr_End</w:t>
             </w:r>
-            <w:proofErr w:type="spellEnd"/>
-            <w:r>
-              <w:rPr>
-                <w:color w:val="auto"/>
-                <w:sz w:val="20"/>
-              </w:rPr>
-              <w:t xml:space="preserve"> </w:t>
-            </w:r>
-            <w:proofErr w:type="spellStart"/>
-            <w:r>
-              <w:rPr>
-                <w:color w:val="auto"/>
-                <w:sz w:val="20"/>
-              </w:rPr>
-              <w:t>ge</w:t>
-            </w:r>
-            <w:proofErr w:type="spellEnd"/>
-            <w:r>
-              <w:rPr>
-                <w:color w:val="auto"/>
-                <w:sz w:val="20"/>
-              </w:rPr>
-              <w:t xml:space="preserve"> </w:t>
-            </w:r>
-            <w:proofErr w:type="spellStart"/>
-            <w:r>
-              <w:rPr>
-                <w:color w:val="auto"/>
-                <w:sz w:val="20"/>
-              </w:rPr>
-              <w:t>DP_MaxDate</w:t>
-            </w:r>
-            <w:proofErr w:type="spellEnd"/>
+            <w:r>
+              <w:rPr>
+                <w:color w:val="auto"/>
+                <w:sz w:val="20"/>
+              </w:rPr>
+              <w:t xml:space="preserve"> ge DP_MaxDate</w:t>
+            </w:r>
           </w:p>
         </w:tc>
       </w:tr>
@@ -18356,7 +17731,6 @@
                 <w:szCs w:val="20"/>
               </w:rPr>
             </w:pPr>
-            <w:proofErr w:type="spellStart"/>
             <w:r>
               <w:rPr>
                 <w:rFonts w:cs="Arial"/>
@@ -18366,7 +17740,6 @@
               </w:rPr>
               <w:t>SortOrder</w:t>
             </w:r>
-            <w:proofErr w:type="spellEnd"/>
           </w:p>
         </w:tc>
         <w:tc>
@@ -18901,8 +18274,7 @@
       <w:pPr>
         <w:pStyle w:val="Heading2"/>
       </w:pPr>
-      <w:bookmarkStart w:id="72" w:name="_Toc176524926"/>
-      <w:proofErr w:type="spellStart"/>
+      <w:bookmarkStart w:id="52" w:name="_Toc176524926"/>
       <w:r>
         <w:lastRenderedPageBreak/>
         <w:t>dem_sex</w:t>
@@ -18910,8 +18282,7 @@
       <w:r>
         <w:t>ct_md</w:t>
       </w:r>
-      <w:bookmarkEnd w:id="72"/>
-      <w:proofErr w:type="spellEnd"/>
+      <w:bookmarkEnd w:id="52"/>
     </w:p>
     <w:p>
       <w:pPr>
@@ -19430,61 +18801,7 @@
                 <w:sz w:val="20"/>
                 <w:szCs w:val="20"/>
               </w:rPr>
-              <w:t>(A)</w:t>
-            </w:r>
-            <w:proofErr w:type="spellStart"/>
-            <w:r>
-              <w:rPr>
-                <w:color w:val="auto"/>
-                <w:sz w:val="20"/>
-                <w:szCs w:val="20"/>
-              </w:rPr>
-              <w:t>mbiguous</w:t>
-            </w:r>
-            <w:proofErr w:type="spellEnd"/>
-            <w:r>
-              <w:rPr>
-                <w:color w:val="auto"/>
-                <w:sz w:val="20"/>
-                <w:szCs w:val="20"/>
-              </w:rPr>
-              <w:t>, F(</w:t>
-            </w:r>
-            <w:proofErr w:type="spellStart"/>
-            <w:r>
-              <w:rPr>
-                <w:color w:val="auto"/>
-                <w:sz w:val="20"/>
-                <w:szCs w:val="20"/>
-              </w:rPr>
-              <w:t>emale</w:t>
-            </w:r>
-            <w:proofErr w:type="spellEnd"/>
-            <w:r>
-              <w:rPr>
-                <w:color w:val="auto"/>
-                <w:sz w:val="20"/>
-                <w:szCs w:val="20"/>
-              </w:rPr>
-              <w:t>), M(ale), U(</w:t>
-            </w:r>
-            <w:proofErr w:type="spellStart"/>
-            <w:r>
-              <w:rPr>
-                <w:color w:val="auto"/>
-                <w:sz w:val="20"/>
-                <w:szCs w:val="20"/>
-              </w:rPr>
-              <w:t>nknown</w:t>
-            </w:r>
-            <w:proofErr w:type="spellEnd"/>
-            <w:r>
-              <w:rPr>
-                <w:color w:val="auto"/>
-                <w:sz w:val="20"/>
-                <w:szCs w:val="20"/>
-              </w:rPr>
-              <w:t>)</w:t>
+              <w:t>(A)mbiguous, F(emale), M(ale), U(nknown)</w:t>
             </w:r>
           </w:p>
         </w:tc>
@@ -19646,17 +18963,8 @@
                 <w:color w:val="auto"/>
                 <w:sz w:val="20"/>
               </w:rPr>
-              <w:t xml:space="preserve">Count of unique </w:t>
-            </w:r>
-            <w:proofErr w:type="spellStart"/>
-            <w:r>
-              <w:rPr>
-                <w:color w:val="auto"/>
-                <w:sz w:val="20"/>
-              </w:rPr>
-              <w:t>PatID</w:t>
-            </w:r>
-            <w:proofErr w:type="spellEnd"/>
+              <w:t>Count of unique PatID</w:t>
+            </w:r>
           </w:p>
         </w:tc>
       </w:tr>
@@ -20048,16 +19356,14 @@
       <w:pPr>
         <w:pStyle w:val="Heading2"/>
       </w:pPr>
-      <w:bookmarkStart w:id="73" w:name="_Toc176524927"/>
-      <w:proofErr w:type="spellStart"/>
+      <w:bookmarkStart w:id="53" w:name="_Toc176524927"/>
       <w:r>
         <w:t>dem_hispanic</w:t>
       </w:r>
       <w:r>
         <w:t>ct_md</w:t>
       </w:r>
-      <w:bookmarkEnd w:id="73"/>
-      <w:proofErr w:type="spellEnd"/>
+      <w:bookmarkEnd w:id="53"/>
     </w:p>
     <w:p>
       <w:pPr>
@@ -20576,18 +19882,8 @@
                 <w:sz w:val="20"/>
                 <w:szCs w:val="20"/>
               </w:rPr>
-              <w:t>N(o), Y(es), (U)</w:t>
-            </w:r>
-            <w:proofErr w:type="spellStart"/>
-            <w:r>
-              <w:rPr>
-                <w:color w:val="auto"/>
-                <w:sz w:val="20"/>
-                <w:szCs w:val="20"/>
-              </w:rPr>
-              <w:t>nknown</w:t>
-            </w:r>
-            <w:proofErr w:type="spellEnd"/>
+              <w:t>N(o), Y(es), (U)nknown</w:t>
+            </w:r>
           </w:p>
         </w:tc>
         <w:tc>
@@ -20748,17 +20044,8 @@
                 <w:color w:val="auto"/>
                 <w:sz w:val="20"/>
               </w:rPr>
-              <w:t xml:space="preserve">Count of unique </w:t>
-            </w:r>
-            <w:proofErr w:type="spellStart"/>
-            <w:r>
-              <w:rPr>
-                <w:color w:val="auto"/>
-                <w:sz w:val="20"/>
-              </w:rPr>
-              <w:t>PatID</w:t>
-            </w:r>
-            <w:proofErr w:type="spellEnd"/>
+              <w:t>Count of unique PatID</w:t>
+            </w:r>
           </w:p>
         </w:tc>
       </w:tr>
@@ -21086,8 +20373,7 @@
       <w:r>
         <w:t xml:space="preserve"> </w:t>
       </w:r>
-      <w:bookmarkStart w:id="74" w:name="_Toc176524928"/>
-      <w:proofErr w:type="spellStart"/>
+      <w:bookmarkStart w:id="54" w:name="_Toc176524928"/>
       <w:r>
         <w:t>dem_</w:t>
       </w:r>
@@ -21100,8 +20386,7 @@
       <w:r>
         <w:t>_md</w:t>
       </w:r>
-      <w:bookmarkEnd w:id="74"/>
-      <w:proofErr w:type="spellEnd"/>
+      <w:bookmarkEnd w:id="54"/>
     </w:p>
     <w:p>
       <w:pPr>
@@ -21864,17 +21149,8 @@
                 <w:color w:val="auto"/>
                 <w:sz w:val="20"/>
               </w:rPr>
-              <w:t xml:space="preserve">Count of unique </w:t>
-            </w:r>
-            <w:proofErr w:type="spellStart"/>
-            <w:r>
-              <w:rPr>
-                <w:color w:val="auto"/>
-                <w:sz w:val="20"/>
-              </w:rPr>
-              <w:t>PatID</w:t>
-            </w:r>
-            <w:proofErr w:type="spellEnd"/>
+              <w:t>Count of unique PatID</w:t>
+            </w:r>
           </w:p>
         </w:tc>
       </w:tr>
@@ -22415,7 +21691,7 @@
           <w:szCs w:val="28"/>
         </w:rPr>
       </w:pPr>
-      <w:bookmarkStart w:id="75" w:name="_Toc32229620"/>
+      <w:bookmarkStart w:id="55" w:name="_Toc32229620"/>
       <w:r>
         <w:br w:type="page"/>
       </w:r>
@@ -22424,8 +21700,7 @@
       <w:pPr>
         <w:pStyle w:val="Heading2"/>
       </w:pPr>
-      <w:bookmarkStart w:id="76" w:name="_Toc176524929"/>
-      <w:proofErr w:type="spellStart"/>
+      <w:bookmarkStart w:id="56" w:name="_Toc176524929"/>
       <w:r>
         <w:lastRenderedPageBreak/>
         <w:t>dem_</w:t>
@@ -22436,8 +21711,7 @@
       <w:r>
         <w:t>ct_md</w:t>
       </w:r>
-      <w:bookmarkEnd w:id="76"/>
-      <w:proofErr w:type="spellEnd"/>
+      <w:bookmarkEnd w:id="56"/>
     </w:p>
     <w:p>
       <w:pPr>
@@ -22833,7 +22107,6 @@
                 <w:szCs w:val="20"/>
               </w:rPr>
             </w:pPr>
-            <w:proofErr w:type="spellStart"/>
             <w:r>
               <w:rPr>
                 <w:rFonts w:cs="Arial"/>
@@ -22843,7 +22116,6 @@
               </w:rPr>
               <w:t>StateCode</w:t>
             </w:r>
-            <w:proofErr w:type="spellEnd"/>
           </w:p>
         </w:tc>
         <w:tc>
@@ -23306,17 +22578,8 @@
                 <w:color w:val="auto"/>
                 <w:sz w:val="20"/>
               </w:rPr>
-              <w:t xml:space="preserve">Count of unique </w:t>
-            </w:r>
-            <w:proofErr w:type="spellStart"/>
-            <w:r>
-              <w:rPr>
-                <w:color w:val="auto"/>
-                <w:sz w:val="20"/>
-              </w:rPr>
-              <w:t>PatID</w:t>
-            </w:r>
-            <w:proofErr w:type="spellEnd"/>
+              <w:t>Count of unique PatID</w:t>
+            </w:r>
           </w:p>
         </w:tc>
       </w:tr>
@@ -23833,19 +23096,12 @@
       <w:r>
         <w:t xml:space="preserve"> </w:t>
       </w:r>
-      <w:bookmarkStart w:id="77" w:name="_Toc176524930"/>
-      <w:proofErr w:type="spellStart"/>
+      <w:bookmarkStart w:id="57" w:name="_Toc176524930"/>
       <w:r>
-        <w:t>dis_pat_rxcount_</w:t>
+        <w:t>dis_pat_rxcount_md</w:t>
       </w:r>
-      <w:proofErr w:type="gramStart"/>
-      <w:r>
-        <w:t>md</w:t>
-      </w:r>
-      <w:bookmarkEnd w:id="75"/>
-      <w:bookmarkEnd w:id="77"/>
-      <w:proofErr w:type="spellEnd"/>
-      <w:proofErr w:type="gramEnd"/>
+      <w:bookmarkEnd w:id="55"/>
+      <w:bookmarkEnd w:id="57"/>
     </w:p>
     <w:p>
       <w:pPr>
@@ -23866,21 +23122,13 @@
         </w:rPr>
         <w:t>Description</w:t>
       </w:r>
-      <w:bookmarkStart w:id="78" w:name="_Hlk31607478"/>
+      <w:bookmarkStart w:id="58" w:name="_Hlk31607478"/>
     </w:p>
     <w:p>
       <w:r>
-        <w:t xml:space="preserve">Number of </w:t>
+        <w:t xml:space="preserve">Number of dispensings per member, while actively enrolled in medical and drug coverage. </w:t>
       </w:r>
-      <w:proofErr w:type="spellStart"/>
-      <w:r>
-        <w:t>dispensings</w:t>
-      </w:r>
-      <w:proofErr w:type="spellEnd"/>
-      <w:r>
-        <w:t xml:space="preserve"> per member, while actively enrolled in medical and drug coverage. </w:t>
-      </w:r>
-      <w:bookmarkEnd w:id="78"/>
+      <w:bookmarkEnd w:id="58"/>
     </w:p>
     <w:p>
       <w:pPr>
@@ -24242,7 +23490,6 @@
                 <w:szCs w:val="20"/>
               </w:rPr>
             </w:pPr>
-            <w:proofErr w:type="spellStart"/>
             <w:r>
               <w:rPr>
                 <w:rFonts w:cs="Arial"/>
@@ -24252,7 +23499,6 @@
               </w:rPr>
               <w:t>Rx_Count</w:t>
             </w:r>
-            <w:proofErr w:type="spellEnd"/>
           </w:p>
         </w:tc>
         <w:tc>
@@ -24369,33 +23615,8 @@
                 <w:color w:val="auto"/>
                 <w:sz w:val="20"/>
               </w:rPr>
-              <w:t xml:space="preserve">Number of unique </w:t>
-            </w:r>
-            <w:proofErr w:type="spellStart"/>
-            <w:r>
-              <w:rPr>
-                <w:color w:val="auto"/>
-                <w:sz w:val="20"/>
-              </w:rPr>
-              <w:t>dispensings</w:t>
-            </w:r>
-            <w:proofErr w:type="spellEnd"/>
-            <w:r>
-              <w:rPr>
-                <w:color w:val="auto"/>
-                <w:sz w:val="20"/>
-              </w:rPr>
-              <w:t xml:space="preserve"> during active enrollment by </w:t>
-            </w:r>
-            <w:proofErr w:type="spellStart"/>
-            <w:r>
-              <w:rPr>
-                <w:color w:val="auto"/>
-                <w:sz w:val="20"/>
-              </w:rPr>
-              <w:t>PatID</w:t>
-            </w:r>
-            <w:proofErr w:type="spellEnd"/>
+              <w:t>Number of unique dispensings during active enrollment by PatID</w:t>
+            </w:r>
           </w:p>
         </w:tc>
       </w:tr>
@@ -24543,23 +23764,7 @@
                 <w:color w:val="auto"/>
                 <w:sz w:val="20"/>
               </w:rPr>
-              <w:t xml:space="preserve">Count of unique </w:t>
-            </w:r>
-            <w:proofErr w:type="spellStart"/>
-            <w:r>
-              <w:rPr>
-                <w:color w:val="auto"/>
-                <w:sz w:val="20"/>
-              </w:rPr>
-              <w:t>PatID</w:t>
-            </w:r>
-            <w:proofErr w:type="spellEnd"/>
-            <w:r>
-              <w:rPr>
-                <w:color w:val="auto"/>
-                <w:sz w:val="20"/>
-              </w:rPr>
-              <w:t xml:space="preserve"> </w:t>
+              <w:t xml:space="preserve">Count of unique PatID </w:t>
             </w:r>
           </w:p>
         </w:tc>
@@ -25216,23 +24421,16 @@
       <w:pPr>
         <w:pStyle w:val="Heading2"/>
       </w:pPr>
-      <w:bookmarkStart w:id="79" w:name="_Toc32229621"/>
+      <w:bookmarkStart w:id="59" w:name="_Toc32229621"/>
       <w:r>
         <w:t xml:space="preserve"> </w:t>
       </w:r>
-      <w:bookmarkStart w:id="80" w:name="_Toc176524931"/>
-      <w:proofErr w:type="spellStart"/>
+      <w:bookmarkStart w:id="60" w:name="_Toc176524931"/>
       <w:r>
-        <w:t>dis_pat_rxcount_</w:t>
+        <w:t>dis_pat_rxcount_d</w:t>
       </w:r>
-      <w:proofErr w:type="gramStart"/>
-      <w:r>
-        <w:t>d</w:t>
-      </w:r>
-      <w:bookmarkEnd w:id="79"/>
-      <w:bookmarkEnd w:id="80"/>
-      <w:proofErr w:type="spellEnd"/>
-      <w:proofErr w:type="gramEnd"/>
+      <w:bookmarkEnd w:id="59"/>
+      <w:bookmarkEnd w:id="60"/>
     </w:p>
     <w:p>
       <w:pPr>
@@ -25256,15 +24454,7 @@
     </w:p>
     <w:p>
       <w:r>
-        <w:t xml:space="preserve">Number of </w:t>
-      </w:r>
-      <w:proofErr w:type="spellStart"/>
-      <w:r>
-        <w:t>dispensings</w:t>
-      </w:r>
-      <w:proofErr w:type="spellEnd"/>
-      <w:r>
-        <w:t xml:space="preserve"> per member, while actively enrolled in drug coverage. </w:t>
+        <w:t xml:space="preserve">Number of dispensings per member, while actively enrolled in drug coverage. </w:t>
       </w:r>
     </w:p>
     <w:p>
@@ -25627,7 +24817,6 @@
                 <w:szCs w:val="20"/>
               </w:rPr>
             </w:pPr>
-            <w:proofErr w:type="spellStart"/>
             <w:r>
               <w:rPr>
                 <w:rFonts w:cs="Arial"/>
@@ -25637,7 +24826,6 @@
               </w:rPr>
               <w:t>Rx_Count</w:t>
             </w:r>
-            <w:proofErr w:type="spellEnd"/>
           </w:p>
         </w:tc>
         <w:tc>
@@ -25754,33 +24942,8 @@
                 <w:color w:val="auto"/>
                 <w:sz w:val="20"/>
               </w:rPr>
-              <w:t xml:space="preserve">Number of unique </w:t>
-            </w:r>
-            <w:proofErr w:type="spellStart"/>
-            <w:r>
-              <w:rPr>
-                <w:color w:val="auto"/>
-                <w:sz w:val="20"/>
-              </w:rPr>
-              <w:t>dispensings</w:t>
-            </w:r>
-            <w:proofErr w:type="spellEnd"/>
-            <w:r>
-              <w:rPr>
-                <w:color w:val="auto"/>
-                <w:sz w:val="20"/>
-              </w:rPr>
-              <w:t xml:space="preserve"> during active enrollment by </w:t>
-            </w:r>
-            <w:proofErr w:type="spellStart"/>
-            <w:r>
-              <w:rPr>
-                <w:color w:val="auto"/>
-                <w:sz w:val="20"/>
-              </w:rPr>
-              <w:t>PatID</w:t>
-            </w:r>
-            <w:proofErr w:type="spellEnd"/>
+              <w:t>Number of unique dispensings during active enrollment by PatID</w:t>
+            </w:r>
           </w:p>
         </w:tc>
       </w:tr>
@@ -25927,23 +25090,7 @@
                 <w:color w:val="auto"/>
                 <w:sz w:val="20"/>
               </w:rPr>
-              <w:t xml:space="preserve">Count of unique </w:t>
-            </w:r>
-            <w:proofErr w:type="spellStart"/>
-            <w:r>
-              <w:rPr>
-                <w:color w:val="auto"/>
-                <w:sz w:val="20"/>
-              </w:rPr>
-              <w:t>PatID</w:t>
-            </w:r>
-            <w:proofErr w:type="spellEnd"/>
-            <w:r>
-              <w:rPr>
-                <w:color w:val="auto"/>
-                <w:sz w:val="20"/>
-              </w:rPr>
-              <w:t xml:space="preserve"> </w:t>
+              <w:t xml:space="preserve">Count of unique PatID </w:t>
             </w:r>
           </w:p>
         </w:tc>
@@ -26610,16 +25757,14 @@
       <w:pPr>
         <w:pStyle w:val="Heading2"/>
       </w:pPr>
-      <w:bookmarkStart w:id="81" w:name="_Toc32229622"/>
-      <w:bookmarkStart w:id="82" w:name="_Toc176524932"/>
-      <w:proofErr w:type="spellStart"/>
+      <w:bookmarkStart w:id="61" w:name="_Toc32229622"/>
+      <w:bookmarkStart w:id="62" w:name="_Toc176524932"/>
       <w:r>
         <w:lastRenderedPageBreak/>
         <w:t>enc_pat_enccount_md</w:t>
       </w:r>
-      <w:bookmarkEnd w:id="81"/>
-      <w:bookmarkEnd w:id="82"/>
-      <w:proofErr w:type="spellEnd"/>
+      <w:bookmarkEnd w:id="61"/>
+      <w:bookmarkEnd w:id="62"/>
     </w:p>
     <w:p>
       <w:pPr>
@@ -27010,7 +26155,6 @@
                 <w:szCs w:val="20"/>
               </w:rPr>
             </w:pPr>
-            <w:proofErr w:type="spellStart"/>
             <w:r>
               <w:rPr>
                 <w:rFonts w:cs="Arial"/>
@@ -27020,7 +26164,6 @@
               </w:rPr>
               <w:t>Enc_Count</w:t>
             </w:r>
-            <w:proofErr w:type="spellEnd"/>
           </w:p>
         </w:tc>
         <w:tc>
@@ -27137,17 +26280,8 @@
                 <w:color w:val="auto"/>
                 <w:sz w:val="20"/>
               </w:rPr>
-              <w:t xml:space="preserve">Number of unique encounters during active enrollment by </w:t>
-            </w:r>
-            <w:proofErr w:type="spellStart"/>
-            <w:r>
-              <w:rPr>
-                <w:color w:val="auto"/>
-                <w:sz w:val="20"/>
-              </w:rPr>
-              <w:t>PatID</w:t>
-            </w:r>
-            <w:proofErr w:type="spellEnd"/>
+              <w:t>Number of unique encounters during active enrollment by PatID</w:t>
+            </w:r>
           </w:p>
         </w:tc>
       </w:tr>
@@ -27294,23 +26428,7 @@
                 <w:color w:val="auto"/>
                 <w:sz w:val="20"/>
               </w:rPr>
-              <w:t xml:space="preserve">Count of unique </w:t>
-            </w:r>
-            <w:proofErr w:type="spellStart"/>
-            <w:r>
-              <w:rPr>
-                <w:color w:val="auto"/>
-                <w:sz w:val="20"/>
-              </w:rPr>
-              <w:t>PatID</w:t>
-            </w:r>
-            <w:proofErr w:type="spellEnd"/>
-            <w:r>
-              <w:rPr>
-                <w:color w:val="auto"/>
-                <w:sz w:val="20"/>
-              </w:rPr>
-              <w:t xml:space="preserve"> </w:t>
+              <w:t xml:space="preserve">Count of unique PatID </w:t>
             </w:r>
           </w:p>
         </w:tc>
@@ -27966,18 +27084,16 @@
       <w:pPr>
         <w:pStyle w:val="Heading2"/>
       </w:pPr>
-      <w:bookmarkStart w:id="83" w:name="_Toc32229623"/>
+      <w:bookmarkStart w:id="63" w:name="_Toc32229623"/>
       <w:r>
         <w:t xml:space="preserve"> </w:t>
       </w:r>
-      <w:bookmarkStart w:id="84" w:name="_Toc176524933"/>
-      <w:proofErr w:type="spellStart"/>
+      <w:bookmarkStart w:id="64" w:name="_Toc176524933"/>
       <w:r>
         <w:t>lab_pat_testcount_md</w:t>
       </w:r>
-      <w:bookmarkEnd w:id="83"/>
-      <w:bookmarkEnd w:id="84"/>
-      <w:proofErr w:type="spellEnd"/>
+      <w:bookmarkEnd w:id="63"/>
+      <w:bookmarkEnd w:id="64"/>
     </w:p>
     <w:p>
       <w:pPr>
@@ -28354,7 +27470,6 @@
                 <w:szCs w:val="20"/>
               </w:rPr>
             </w:pPr>
-            <w:proofErr w:type="spellStart"/>
             <w:r>
               <w:rPr>
                 <w:rFonts w:cs="Arial"/>
@@ -28373,7 +27488,6 @@
               </w:rPr>
               <w:t>_Count</w:t>
             </w:r>
-            <w:proofErr w:type="spellEnd"/>
           </w:p>
         </w:tc>
         <w:tc>
@@ -28499,17 +27613,8 @@
                 <w:color w:val="auto"/>
                 <w:sz w:val="20"/>
               </w:rPr>
-              <w:t xml:space="preserve">Number of unique laboratory test results during active enrollment by </w:t>
-            </w:r>
-            <w:proofErr w:type="spellStart"/>
-            <w:r>
-              <w:rPr>
-                <w:color w:val="auto"/>
-                <w:sz w:val="20"/>
-              </w:rPr>
-              <w:t>PatID</w:t>
-            </w:r>
-            <w:proofErr w:type="spellEnd"/>
+              <w:t>Number of unique laboratory test results during active enrollment by PatID</w:t>
+            </w:r>
           </w:p>
         </w:tc>
       </w:tr>
@@ -28656,23 +27761,7 @@
                 <w:color w:val="auto"/>
                 <w:sz w:val="20"/>
               </w:rPr>
-              <w:t xml:space="preserve">Count of unique </w:t>
-            </w:r>
-            <w:proofErr w:type="spellStart"/>
-            <w:r>
-              <w:rPr>
-                <w:color w:val="auto"/>
-                <w:sz w:val="20"/>
-              </w:rPr>
-              <w:t>PatID</w:t>
-            </w:r>
-            <w:proofErr w:type="spellEnd"/>
-            <w:r>
-              <w:rPr>
-                <w:color w:val="auto"/>
-                <w:sz w:val="20"/>
-              </w:rPr>
-              <w:t xml:space="preserve"> </w:t>
+              <w:t xml:space="preserve">Count of unique PatID </w:t>
             </w:r>
           </w:p>
         </w:tc>
@@ -29343,21 +28432,19 @@
       <w:pPr>
         <w:pStyle w:val="Heading2"/>
       </w:pPr>
-      <w:bookmarkStart w:id="85" w:name="_Toc32229624"/>
-      <w:bookmarkStart w:id="86" w:name="_Hlk31639662"/>
+      <w:bookmarkStart w:id="65" w:name="_Toc32229624"/>
+      <w:bookmarkStart w:id="66" w:name="_Hlk31639662"/>
       <w:r>
         <w:lastRenderedPageBreak/>
         <w:t xml:space="preserve"> </w:t>
       </w:r>
-      <w:bookmarkStart w:id="87" w:name="_Toc176524934"/>
-      <w:proofErr w:type="spellStart"/>
+      <w:bookmarkStart w:id="67" w:name="_Toc176524934"/>
       <w:r>
         <w:t>vit_pat_vitct_md</w:t>
       </w:r>
-      <w:bookmarkEnd w:id="85"/>
-      <w:bookmarkEnd w:id="86"/>
-      <w:bookmarkEnd w:id="87"/>
-      <w:proofErr w:type="spellEnd"/>
+      <w:bookmarkEnd w:id="65"/>
+      <w:bookmarkEnd w:id="66"/>
+      <w:bookmarkEnd w:id="67"/>
     </w:p>
     <w:p>
       <w:pPr>
@@ -29744,7 +28831,6 @@
                 <w:szCs w:val="20"/>
               </w:rPr>
             </w:pPr>
-            <w:proofErr w:type="spellStart"/>
             <w:r>
               <w:rPr>
                 <w:rFonts w:cs="Arial"/>
@@ -29754,7 +28840,6 @@
               </w:rPr>
               <w:t>VS_type</w:t>
             </w:r>
-            <w:proofErr w:type="spellEnd"/>
           </w:p>
         </w:tc>
         <w:tc>
@@ -30015,16 +29100,8 @@
               <w:rPr>
                 <w:sz w:val="20"/>
               </w:rPr>
-              <w:t xml:space="preserve">Count of unique </w:t>
-            </w:r>
-            <w:proofErr w:type="spellStart"/>
-            <w:r>
-              <w:rPr>
-                <w:sz w:val="20"/>
-              </w:rPr>
-              <w:t>PatID</w:t>
-            </w:r>
-            <w:proofErr w:type="spellEnd"/>
+              <w:t>Count of unique PatID</w:t>
+            </w:r>
             <w:r>
               <w:rPr>
                 <w:sz w:val="20"/>
@@ -30461,7 +29538,7 @@
           <w:szCs w:val="32"/>
         </w:rPr>
       </w:pPr>
-      <w:bookmarkStart w:id="88" w:name="_Toc32229625"/>
+      <w:bookmarkStart w:id="68" w:name="_Toc32229625"/>
       <w:r>
         <w:rPr>
           <w:sz w:val="24"/>
@@ -30473,15 +29550,13 @@
       <w:pPr>
         <w:pStyle w:val="Heading2"/>
       </w:pPr>
-      <w:bookmarkStart w:id="89" w:name="_Toc176524935"/>
-      <w:proofErr w:type="spellStart"/>
+      <w:bookmarkStart w:id="69" w:name="_Toc176524935"/>
       <w:r>
         <w:lastRenderedPageBreak/>
         <w:t>enr_pat_enrcount_md</w:t>
       </w:r>
-      <w:bookmarkEnd w:id="88"/>
-      <w:bookmarkEnd w:id="89"/>
-      <w:proofErr w:type="spellEnd"/>
+      <w:bookmarkEnd w:id="68"/>
+      <w:bookmarkEnd w:id="69"/>
     </w:p>
     <w:p>
       <w:pPr>
@@ -30859,7 +29934,6 @@
                 <w:szCs w:val="20"/>
               </w:rPr>
             </w:pPr>
-            <w:proofErr w:type="spellStart"/>
             <w:r>
               <w:rPr>
                 <w:rFonts w:cs="Arial"/>
@@ -30869,7 +29943,6 @@
               </w:rPr>
               <w:t>Enr_Count</w:t>
             </w:r>
-            <w:proofErr w:type="spellEnd"/>
           </w:p>
         </w:tc>
         <w:tc>
@@ -30986,17 +30059,8 @@
                 <w:color w:val="auto"/>
                 <w:sz w:val="20"/>
               </w:rPr>
-              <w:t xml:space="preserve">Number of unique active enrollment spans by </w:t>
-            </w:r>
-            <w:proofErr w:type="spellStart"/>
-            <w:r>
-              <w:rPr>
-                <w:color w:val="auto"/>
-                <w:sz w:val="20"/>
-              </w:rPr>
-              <w:t>PatID</w:t>
-            </w:r>
-            <w:proofErr w:type="spellEnd"/>
+              <w:t>Number of unique active enrollment spans by PatID</w:t>
+            </w:r>
           </w:p>
         </w:tc>
       </w:tr>
@@ -31144,23 +30208,7 @@
                 <w:color w:val="auto"/>
                 <w:sz w:val="20"/>
               </w:rPr>
-              <w:t xml:space="preserve">Count of unique </w:t>
-            </w:r>
-            <w:proofErr w:type="spellStart"/>
-            <w:r>
-              <w:rPr>
-                <w:color w:val="auto"/>
-                <w:sz w:val="20"/>
-              </w:rPr>
-              <w:t>PatID</w:t>
-            </w:r>
-            <w:proofErr w:type="spellEnd"/>
-            <w:r>
-              <w:rPr>
-                <w:color w:val="auto"/>
-                <w:sz w:val="20"/>
-              </w:rPr>
-              <w:t xml:space="preserve"> </w:t>
+              <w:t xml:space="preserve">Count of unique PatID </w:t>
             </w:r>
           </w:p>
         </w:tc>
@@ -31841,7 +30889,7 @@
           <w:szCs w:val="32"/>
         </w:rPr>
       </w:pPr>
-      <w:bookmarkStart w:id="90" w:name="_Toc32229626"/>
+      <w:bookmarkStart w:id="70" w:name="_Toc32229626"/>
       <w:r>
         <w:rPr>
           <w:sz w:val="24"/>
@@ -31857,14 +30905,12 @@
         <w:lastRenderedPageBreak/>
         <w:t xml:space="preserve"> </w:t>
       </w:r>
-      <w:bookmarkStart w:id="91" w:name="_Toc176524936"/>
-      <w:proofErr w:type="spellStart"/>
+      <w:bookmarkStart w:id="71" w:name="_Toc176524936"/>
       <w:r>
         <w:t>dth_dthct_md</w:t>
       </w:r>
-      <w:bookmarkEnd w:id="90"/>
-      <w:bookmarkEnd w:id="91"/>
-      <w:proofErr w:type="spellEnd"/>
+      <w:bookmarkEnd w:id="70"/>
+      <w:bookmarkEnd w:id="71"/>
     </w:p>
     <w:p>
       <w:pPr>
@@ -32533,18 +31579,16 @@
       <w:pPr>
         <w:pStyle w:val="Heading2"/>
       </w:pPr>
-      <w:bookmarkStart w:id="92" w:name="_Toc32229627"/>
+      <w:bookmarkStart w:id="72" w:name="_Toc32229627"/>
       <w:r>
         <w:t xml:space="preserve"> </w:t>
       </w:r>
-      <w:bookmarkStart w:id="93" w:name="_Toc176524937"/>
-      <w:proofErr w:type="spellStart"/>
+      <w:bookmarkStart w:id="73" w:name="_Toc176524937"/>
       <w:r>
         <w:t>dth_dthct_m</w:t>
       </w:r>
-      <w:bookmarkEnd w:id="92"/>
-      <w:bookmarkEnd w:id="93"/>
-      <w:proofErr w:type="spellEnd"/>
+      <w:bookmarkEnd w:id="72"/>
+      <w:bookmarkEnd w:id="73"/>
     </w:p>
     <w:p>
       <w:pPr>
@@ -33213,19 +32257,17 @@
       <w:pPr>
         <w:pStyle w:val="Heading2"/>
       </w:pPr>
-      <w:bookmarkStart w:id="94" w:name="_Toc32229628"/>
+      <w:bookmarkStart w:id="74" w:name="_Toc32229628"/>
       <w:r>
         <w:lastRenderedPageBreak/>
         <w:t xml:space="preserve"> </w:t>
       </w:r>
-      <w:bookmarkStart w:id="95" w:name="_Toc176524938"/>
-      <w:proofErr w:type="spellStart"/>
+      <w:bookmarkStart w:id="75" w:name="_Toc176524938"/>
       <w:r>
         <w:t>cod_pat_codct_md</w:t>
       </w:r>
-      <w:bookmarkEnd w:id="94"/>
-      <w:bookmarkEnd w:id="95"/>
-      <w:proofErr w:type="spellEnd"/>
+      <w:bookmarkEnd w:id="74"/>
+      <w:bookmarkEnd w:id="75"/>
     </w:p>
     <w:p>
       <w:pPr>
@@ -33609,7 +32651,6 @@
                 <w:szCs w:val="20"/>
               </w:rPr>
             </w:pPr>
-            <w:proofErr w:type="spellStart"/>
             <w:r>
               <w:rPr>
                 <w:rFonts w:cs="Arial"/>
@@ -33628,7 +32669,6 @@
               </w:rPr>
               <w:t>_Count</w:t>
             </w:r>
-            <w:proofErr w:type="spellEnd"/>
           </w:p>
         </w:tc>
         <w:tc>
@@ -33754,17 +32794,8 @@
                 <w:color w:val="auto"/>
                 <w:sz w:val="20"/>
               </w:rPr>
-              <w:t xml:space="preserve">Number of COD records by </w:t>
-            </w:r>
-            <w:proofErr w:type="spellStart"/>
-            <w:r>
-              <w:rPr>
-                <w:color w:val="auto"/>
-                <w:sz w:val="20"/>
-              </w:rPr>
-              <w:t>PatID</w:t>
-            </w:r>
-            <w:proofErr w:type="spellEnd"/>
+              <w:t>Number of COD records by PatID</w:t>
+            </w:r>
           </w:p>
         </w:tc>
       </w:tr>
@@ -33911,23 +32942,7 @@
                 <w:color w:val="auto"/>
                 <w:sz w:val="20"/>
               </w:rPr>
-              <w:t xml:space="preserve">Count of unique </w:t>
-            </w:r>
-            <w:proofErr w:type="spellStart"/>
-            <w:r>
-              <w:rPr>
-                <w:color w:val="auto"/>
-                <w:sz w:val="20"/>
-              </w:rPr>
-              <w:t>PatID</w:t>
-            </w:r>
-            <w:proofErr w:type="spellEnd"/>
-            <w:r>
-              <w:rPr>
-                <w:color w:val="auto"/>
-                <w:sz w:val="20"/>
-              </w:rPr>
-              <w:t xml:space="preserve"> </w:t>
+              <w:t xml:space="preserve">Count of unique PatID </w:t>
             </w:r>
           </w:p>
         </w:tc>
@@ -34590,7 +33605,7 @@
           <w:szCs w:val="28"/>
         </w:rPr>
       </w:pPr>
-      <w:bookmarkStart w:id="96" w:name="_Toc32229629"/>
+      <w:bookmarkStart w:id="76" w:name="_Toc32229629"/>
       <w:r>
         <w:br w:type="page"/>
       </w:r>
@@ -34599,8 +33614,7 @@
       <w:pPr>
         <w:pStyle w:val="Heading2"/>
       </w:pPr>
-      <w:bookmarkStart w:id="97" w:name="_Toc176524939"/>
-      <w:proofErr w:type="spellStart"/>
+      <w:bookmarkStart w:id="77" w:name="_Toc176524939"/>
       <w:r>
         <w:lastRenderedPageBreak/>
         <w:t>cod_</w:t>
@@ -34611,9 +33625,8 @@
       <w:r>
         <w:t>codct_m</w:t>
       </w:r>
-      <w:bookmarkEnd w:id="96"/>
-      <w:bookmarkEnd w:id="97"/>
-      <w:proofErr w:type="spellEnd"/>
+      <w:bookmarkEnd w:id="76"/>
+      <w:bookmarkEnd w:id="77"/>
     </w:p>
     <w:p>
       <w:pPr>
@@ -34994,7 +34007,6 @@
                 <w:szCs w:val="20"/>
               </w:rPr>
             </w:pPr>
-            <w:proofErr w:type="spellStart"/>
             <w:r>
               <w:rPr>
                 <w:rFonts w:cs="Arial"/>
@@ -35013,7 +34025,6 @@
               </w:rPr>
               <w:t>_Count</w:t>
             </w:r>
-            <w:proofErr w:type="spellEnd"/>
           </w:p>
         </w:tc>
         <w:tc>
@@ -35139,17 +34150,8 @@
                 <w:color w:val="auto"/>
                 <w:sz w:val="20"/>
               </w:rPr>
-              <w:t xml:space="preserve">Number of COD records by </w:t>
-            </w:r>
-            <w:proofErr w:type="spellStart"/>
-            <w:r>
-              <w:rPr>
-                <w:color w:val="auto"/>
-                <w:sz w:val="20"/>
-              </w:rPr>
-              <w:t>PatID</w:t>
-            </w:r>
-            <w:proofErr w:type="spellEnd"/>
+              <w:t>Number of COD records by PatID</w:t>
+            </w:r>
           </w:p>
         </w:tc>
       </w:tr>
@@ -35296,23 +34298,7 @@
                 <w:color w:val="auto"/>
                 <w:sz w:val="20"/>
               </w:rPr>
-              <w:t xml:space="preserve">Count of unique </w:t>
-            </w:r>
-            <w:proofErr w:type="spellStart"/>
-            <w:r>
-              <w:rPr>
-                <w:color w:val="auto"/>
-                <w:sz w:val="20"/>
-              </w:rPr>
-              <w:t>PatID</w:t>
-            </w:r>
-            <w:proofErr w:type="spellEnd"/>
-            <w:r>
-              <w:rPr>
-                <w:color w:val="auto"/>
-                <w:sz w:val="20"/>
-              </w:rPr>
-              <w:t xml:space="preserve"> </w:t>
+              <w:t xml:space="preserve">Count of unique PatID </w:t>
             </w:r>
           </w:p>
         </w:tc>
@@ -35969,13 +34955,11 @@
       <w:r>
         <w:t xml:space="preserve"> </w:t>
       </w:r>
-      <w:bookmarkStart w:id="98" w:name="_Toc176524940"/>
-      <w:proofErr w:type="spellStart"/>
+      <w:bookmarkStart w:id="78" w:name="_Toc176524940"/>
       <w:r>
         <w:t>mil_linkage_rates</w:t>
       </w:r>
-      <w:bookmarkEnd w:id="98"/>
-      <w:proofErr w:type="spellEnd"/>
+      <w:bookmarkEnd w:id="78"/>
     </w:p>
     <w:p>
       <w:pPr>
@@ -36004,11 +34988,9 @@
       <w:r>
         <w:t xml:space="preserve">stratified by mother’s age at delivery, encounter type, year, </w:t>
       </w:r>
-      <w:proofErr w:type="spellStart"/>
       <w:r>
         <w:t>birth_type</w:t>
       </w:r>
-      <w:proofErr w:type="spellEnd"/>
       <w:r>
         <w:t>, and overall.</w:t>
       </w:r>
@@ -36472,7 +35454,6 @@
                 <w:szCs w:val="20"/>
               </w:rPr>
             </w:pPr>
-            <w:proofErr w:type="spellStart"/>
             <w:r>
               <w:rPr>
                 <w:color w:val="000000"/>
@@ -36487,43 +35468,24 @@
                 <w:sz w:val="20"/>
                 <w:szCs w:val="20"/>
               </w:rPr>
-              <w:t>gegroup</w:t>
-            </w:r>
-            <w:proofErr w:type="spellEnd"/>
-            <w:r>
-              <w:rPr>
-                <w:color w:val="000000"/>
-                <w:sz w:val="20"/>
-                <w:szCs w:val="20"/>
-              </w:rPr>
-              <w:t xml:space="preserve">, </w:t>
-            </w:r>
-          </w:p>
-          <w:p>
-            <w:pPr>
-              <w:rPr>
-                <w:color w:val="000000"/>
-                <w:sz w:val="20"/>
-                <w:szCs w:val="20"/>
-              </w:rPr>
-            </w:pPr>
-            <w:proofErr w:type="spellStart"/>
-            <w:r>
-              <w:rPr>
-                <w:color w:val="000000"/>
-                <w:sz w:val="20"/>
-                <w:szCs w:val="20"/>
-              </w:rPr>
-              <w:t>enctype</w:t>
-            </w:r>
-            <w:proofErr w:type="spellEnd"/>
-            <w:r>
-              <w:rPr>
-                <w:color w:val="000000"/>
-                <w:sz w:val="20"/>
-                <w:szCs w:val="20"/>
-              </w:rPr>
-              <w:t xml:space="preserve">, </w:t>
+              <w:t xml:space="preserve">gegroup, </w:t>
+            </w:r>
+          </w:p>
+          <w:p>
+            <w:pPr>
+              <w:rPr>
+                <w:color w:val="000000"/>
+                <w:sz w:val="20"/>
+                <w:szCs w:val="20"/>
+              </w:rPr>
+            </w:pPr>
+            <w:r>
+              <w:rPr>
+                <w:color w:val="000000"/>
+                <w:sz w:val="20"/>
+                <w:szCs w:val="20"/>
+              </w:rPr>
+              <w:t xml:space="preserve">enctype, </w:t>
             </w:r>
           </w:p>
           <w:p>
@@ -36551,23 +35513,13 @@
                 <w:szCs w:val="20"/>
               </w:rPr>
             </w:pPr>
-            <w:proofErr w:type="spellStart"/>
-            <w:r>
-              <w:rPr>
-                <w:color w:val="000000"/>
-                <w:sz w:val="20"/>
-                <w:szCs w:val="20"/>
-              </w:rPr>
-              <w:t>birth_type</w:t>
-            </w:r>
-            <w:proofErr w:type="spellEnd"/>
-            <w:r>
-              <w:rPr>
-                <w:color w:val="000000"/>
-                <w:sz w:val="20"/>
-                <w:szCs w:val="20"/>
-              </w:rPr>
-              <w:t xml:space="preserve">, </w:t>
+            <w:r>
+              <w:rPr>
+                <w:color w:val="000000"/>
+                <w:sz w:val="20"/>
+                <w:szCs w:val="20"/>
+              </w:rPr>
+              <w:t xml:space="preserve">birth_type, </w:t>
             </w:r>
           </w:p>
           <w:p>
@@ -36600,22 +35552,13 @@
                 <w:sz w:val="20"/>
               </w:rPr>
             </w:pPr>
-            <w:proofErr w:type="spellStart"/>
             <w:r>
               <w:rPr>
                 <w:color w:val="auto"/>
                 <w:sz w:val="20"/>
               </w:rPr>
               <w:lastRenderedPageBreak/>
-              <w:t>Birth_type</w:t>
-            </w:r>
-            <w:proofErr w:type="spellEnd"/>
-            <w:r>
-              <w:rPr>
-                <w:color w:val="auto"/>
-                <w:sz w:val="20"/>
-              </w:rPr>
-              <w:t xml:space="preserve"> for multiples combined into single category</w:t>
+              <w:t>Birth_type for multiples combined into single category</w:t>
             </w:r>
           </w:p>
         </w:tc>
@@ -36916,7 +35859,6 @@
                 <w:szCs w:val="20"/>
               </w:rPr>
             </w:pPr>
-            <w:proofErr w:type="spellStart"/>
             <w:r>
               <w:rPr>
                 <w:rFonts w:cs="Arial"/>
@@ -36926,7 +35868,6 @@
               </w:rPr>
               <w:t>InfantsLinked</w:t>
             </w:r>
-            <w:proofErr w:type="spellEnd"/>
           </w:p>
         </w:tc>
         <w:tc>
@@ -37055,7 +35996,6 @@
                 <w:szCs w:val="20"/>
               </w:rPr>
             </w:pPr>
-            <w:proofErr w:type="spellStart"/>
             <w:r>
               <w:rPr>
                 <w:rFonts w:cs="Arial"/>
@@ -37065,7 +36005,6 @@
               </w:rPr>
               <w:t>LinkageRate</w:t>
             </w:r>
-            <w:proofErr w:type="spellEnd"/>
           </w:p>
         </w:tc>
         <w:tc>
@@ -37332,7 +36271,6 @@
                 <w:szCs w:val="20"/>
               </w:rPr>
             </w:pPr>
-            <w:proofErr w:type="spellStart"/>
             <w:r>
               <w:rPr>
                 <w:rFonts w:cs="Arial"/>
@@ -37342,7 +36280,6 @@
               </w:rPr>
               <w:t>InfantsLinked</w:t>
             </w:r>
-            <w:proofErr w:type="spellEnd"/>
           </w:p>
         </w:tc>
         <w:tc>
@@ -37358,7 +36295,6 @@
                 <w:szCs w:val="20"/>
               </w:rPr>
             </w:pPr>
-            <w:proofErr w:type="spellStart"/>
             <w:r>
               <w:rPr>
                 <w:rFonts w:cs="Arial"/>
@@ -37368,7 +36304,6 @@
               </w:rPr>
               <w:t>LinkageRate</w:t>
             </w:r>
-            <w:proofErr w:type="spellEnd"/>
           </w:p>
         </w:tc>
       </w:tr>
@@ -37416,7 +36351,6 @@
                 <w:szCs w:val="20"/>
               </w:rPr>
             </w:pPr>
-            <w:proofErr w:type="spellStart"/>
             <w:r>
               <w:rPr>
                 <w:rFonts w:cs="Arial"/>
@@ -37426,7 +36360,6 @@
               </w:rPr>
               <w:t>agegroup</w:t>
             </w:r>
-            <w:proofErr w:type="spellEnd"/>
           </w:p>
         </w:tc>
         <w:tc>
@@ -37584,7 +36517,6 @@
                 <w:szCs w:val="20"/>
               </w:rPr>
             </w:pPr>
-            <w:proofErr w:type="spellStart"/>
             <w:r>
               <w:rPr>
                 <w:rFonts w:cs="Arial"/>
@@ -37594,7 +36526,6 @@
               </w:rPr>
               <w:t>Agegroup</w:t>
             </w:r>
-            <w:proofErr w:type="spellEnd"/>
           </w:p>
         </w:tc>
         <w:tc>
@@ -37737,7 +36668,6 @@
                 <w:szCs w:val="20"/>
               </w:rPr>
             </w:pPr>
-            <w:proofErr w:type="spellStart"/>
             <w:r>
               <w:rPr>
                 <w:rFonts w:cs="Arial"/>
@@ -37747,7 +36677,6 @@
               </w:rPr>
               <w:t>Agegroup</w:t>
             </w:r>
-            <w:proofErr w:type="spellEnd"/>
           </w:p>
         </w:tc>
         <w:tc>
@@ -37896,7 +36825,6 @@
                 <w:szCs w:val="20"/>
               </w:rPr>
             </w:pPr>
-            <w:proofErr w:type="spellStart"/>
             <w:r>
               <w:rPr>
                 <w:rFonts w:cs="Arial"/>
@@ -37933,7 +36861,6 @@
               </w:rPr>
               <w:t>type</w:t>
             </w:r>
-            <w:proofErr w:type="spellEnd"/>
           </w:p>
         </w:tc>
         <w:tc>
@@ -38076,7 +37003,6 @@
                 <w:szCs w:val="20"/>
               </w:rPr>
             </w:pPr>
-            <w:proofErr w:type="spellStart"/>
             <w:r>
               <w:rPr>
                 <w:rFonts w:cs="Arial"/>
@@ -38086,7 +37012,6 @@
               </w:rPr>
               <w:t>Birth_type</w:t>
             </w:r>
-            <w:proofErr w:type="spellEnd"/>
           </w:p>
         </w:tc>
         <w:tc>
@@ -38226,7 +37151,6 @@
                 <w:szCs w:val="20"/>
               </w:rPr>
             </w:pPr>
-            <w:proofErr w:type="spellStart"/>
             <w:r>
               <w:rPr>
                 <w:rFonts w:cs="Arial"/>
@@ -38236,7 +37160,6 @@
               </w:rPr>
               <w:t>Birth_type</w:t>
             </w:r>
-            <w:proofErr w:type="spellEnd"/>
           </w:p>
         </w:tc>
         <w:tc>
@@ -38380,7 +37303,6 @@
                 <w:szCs w:val="20"/>
               </w:rPr>
             </w:pPr>
-            <w:proofErr w:type="spellStart"/>
             <w:r>
               <w:rPr>
                 <w:rFonts w:cs="Arial"/>
@@ -38390,7 +37312,6 @@
               </w:rPr>
               <w:t>Birth_type</w:t>
             </w:r>
-            <w:proofErr w:type="spellEnd"/>
           </w:p>
         </w:tc>
         <w:tc>
@@ -38536,7 +37457,6 @@
                 <w:szCs w:val="20"/>
               </w:rPr>
             </w:pPr>
-            <w:proofErr w:type="spellStart"/>
             <w:r>
               <w:rPr>
                 <w:rFonts w:cs="Arial"/>
@@ -38546,7 +37466,6 @@
               </w:rPr>
               <w:t>Enc_type</w:t>
             </w:r>
-            <w:proofErr w:type="spellEnd"/>
           </w:p>
         </w:tc>
         <w:tc>
@@ -40259,23 +39178,7 @@
         <w:rFonts w:ascii="Calibri" w:eastAsia="Calibri" w:hAnsi="Calibri" w:cs="Times New Roman"/>
         <w:sz w:val="20"/>
       </w:rPr>
-      <w:t>Document Subject (</w:t>
-    </w:r>
-    <w:proofErr w:type="gramStart"/>
-    <w:r>
-      <w:rPr>
-        <w:rFonts w:ascii="Calibri" w:eastAsia="Calibri" w:hAnsi="Calibri" w:cs="Times New Roman"/>
-        <w:sz w:val="20"/>
-      </w:rPr>
-      <w:t>e.g.</w:t>
-    </w:r>
-    <w:proofErr w:type="gramEnd"/>
-    <w:r>
-      <w:rPr>
-        <w:rFonts w:ascii="Calibri" w:eastAsia="Calibri" w:hAnsi="Calibri" w:cs="Times New Roman"/>
-        <w:sz w:val="20"/>
-      </w:rPr>
-      <w:t xml:space="preserve"> Sentinel Surveillance Plan)</w:t>
+      <w:t>Document Subject (e.g. Sentinel Surveillance Plan)</w:t>
     </w:r>
     <w:r>
       <w:rPr>
@@ -41368,26 +40271,26 @@
                           <w:pPr>
                             <w:spacing w:after="0"/>
                           </w:pPr>
-                          <w:bookmarkStart w:id="99" w:name="_Hlk70490196"/>
-                          <w:bookmarkStart w:id="100" w:name="_Hlk70490197"/>
-                          <w:bookmarkStart w:id="101" w:name="_Hlk70490218"/>
-                          <w:bookmarkStart w:id="102" w:name="_Hlk70490219"/>
-                          <w:bookmarkStart w:id="103" w:name="_Hlk70490257"/>
-                          <w:bookmarkStart w:id="104" w:name="_Hlk70490258"/>
-                          <w:bookmarkStart w:id="105" w:name="_Hlk70490293"/>
-                          <w:bookmarkStart w:id="106" w:name="_Hlk70490294"/>
-                          <w:bookmarkStart w:id="107" w:name="_Hlk70490301"/>
-                          <w:bookmarkStart w:id="108" w:name="_Hlk70490302"/>
-                          <w:bookmarkStart w:id="109" w:name="_Hlk70495976"/>
-                          <w:bookmarkStart w:id="110" w:name="_Hlk70495977"/>
-                          <w:bookmarkStart w:id="111" w:name="_Hlk70496079"/>
-                          <w:bookmarkStart w:id="112" w:name="_Hlk70496080"/>
-                          <w:bookmarkStart w:id="113" w:name="_Hlk70503232"/>
-                          <w:bookmarkStart w:id="114" w:name="_Hlk70503233"/>
-                          <w:bookmarkStart w:id="115" w:name="_Hlk70503300"/>
-                          <w:bookmarkStart w:id="116" w:name="_Hlk70503301"/>
-                          <w:bookmarkStart w:id="117" w:name="_Hlk70503547"/>
-                          <w:bookmarkStart w:id="118" w:name="_Hlk70503548"/>
+                          <w:bookmarkStart w:id="79" w:name="_Hlk70490196"/>
+                          <w:bookmarkStart w:id="80" w:name="_Hlk70490197"/>
+                          <w:bookmarkStart w:id="81" w:name="_Hlk70490218"/>
+                          <w:bookmarkStart w:id="82" w:name="_Hlk70490219"/>
+                          <w:bookmarkStart w:id="83" w:name="_Hlk70490257"/>
+                          <w:bookmarkStart w:id="84" w:name="_Hlk70490258"/>
+                          <w:bookmarkStart w:id="85" w:name="_Hlk70490293"/>
+                          <w:bookmarkStart w:id="86" w:name="_Hlk70490294"/>
+                          <w:bookmarkStart w:id="87" w:name="_Hlk70490301"/>
+                          <w:bookmarkStart w:id="88" w:name="_Hlk70490302"/>
+                          <w:bookmarkStart w:id="89" w:name="_Hlk70495976"/>
+                          <w:bookmarkStart w:id="90" w:name="_Hlk70495977"/>
+                          <w:bookmarkStart w:id="91" w:name="_Hlk70496079"/>
+                          <w:bookmarkStart w:id="92" w:name="_Hlk70496080"/>
+                          <w:bookmarkStart w:id="93" w:name="_Hlk70503232"/>
+                          <w:bookmarkStart w:id="94" w:name="_Hlk70503233"/>
+                          <w:bookmarkStart w:id="95" w:name="_Hlk70503300"/>
+                          <w:bookmarkStart w:id="96" w:name="_Hlk70503301"/>
+                          <w:bookmarkStart w:id="97" w:name="_Hlk70503547"/>
+                          <w:bookmarkStart w:id="98" w:name="_Hlk70503548"/>
                           <w:r>
                             <w:rPr>
                               <w:color w:val="000000"/>
@@ -41395,26 +40298,26 @@
                             </w:rPr>
                             <w:t>General Business</w:t>
                           </w:r>
-                          <w:bookmarkEnd w:id="99"/>
-                          <w:bookmarkEnd w:id="100"/>
-                          <w:bookmarkEnd w:id="101"/>
-                          <w:bookmarkEnd w:id="102"/>
-                          <w:bookmarkEnd w:id="103"/>
-                          <w:bookmarkEnd w:id="104"/>
-                          <w:bookmarkEnd w:id="105"/>
-                          <w:bookmarkEnd w:id="106"/>
-                          <w:bookmarkEnd w:id="107"/>
-                          <w:bookmarkEnd w:id="108"/>
-                          <w:bookmarkEnd w:id="109"/>
-                          <w:bookmarkEnd w:id="110"/>
-                          <w:bookmarkEnd w:id="111"/>
-                          <w:bookmarkEnd w:id="112"/>
-                          <w:bookmarkEnd w:id="113"/>
-                          <w:bookmarkEnd w:id="114"/>
-                          <w:bookmarkEnd w:id="115"/>
-                          <w:bookmarkEnd w:id="116"/>
-                          <w:bookmarkEnd w:id="117"/>
-                          <w:bookmarkEnd w:id="118"/>
+                          <w:bookmarkEnd w:id="79"/>
+                          <w:bookmarkEnd w:id="80"/>
+                          <w:bookmarkEnd w:id="81"/>
+                          <w:bookmarkEnd w:id="82"/>
+                          <w:bookmarkEnd w:id="83"/>
+                          <w:bookmarkEnd w:id="84"/>
+                          <w:bookmarkEnd w:id="85"/>
+                          <w:bookmarkEnd w:id="86"/>
+                          <w:bookmarkEnd w:id="87"/>
+                          <w:bookmarkEnd w:id="88"/>
+                          <w:bookmarkEnd w:id="89"/>
+                          <w:bookmarkEnd w:id="90"/>
+                          <w:bookmarkEnd w:id="91"/>
+                          <w:bookmarkEnd w:id="92"/>
+                          <w:bookmarkEnd w:id="93"/>
+                          <w:bookmarkEnd w:id="94"/>
+                          <w:bookmarkEnd w:id="95"/>
+                          <w:bookmarkEnd w:id="96"/>
+                          <w:bookmarkEnd w:id="97"/>
+                          <w:bookmarkEnd w:id="98"/>
                         </w:p>
                       </w:txbxContent>
                     </wps:txbx>
@@ -50186,7 +49089,12 @@
 </file>
 
 <file path=customXml/item2.xml><?xml version="1.0" encoding="utf-8"?>
-<b:Sources xmlns:b="http://schemas.openxmlformats.org/officeDocument/2006/bibliography" xmlns="http://schemas.openxmlformats.org/officeDocument/2006/bibliography" SelectedStyle="\CHICAGO.XSL" StyleName="Chicago" Version="16"/>
+<?mso-contentType ?>
+<FormTemplates xmlns="http://schemas.microsoft.com/sharepoint/v3/contenttype/forms">
+  <Display>DocumentLibraryForm</Display>
+  <Edit>DocumentLibraryForm</Edit>
+  <New>DocumentLibraryForm</New>
+</FormTemplates>
 </file>
 
 <file path=customXml/item3.xml><?xml version="1.0" encoding="utf-8"?>
@@ -50196,12 +49104,7 @@
 </file>
 
 <file path=customXml/item4.xml><?xml version="1.0" encoding="utf-8"?>
-<?mso-contentType ?>
-<FormTemplates xmlns="http://schemas.microsoft.com/sharepoint/v3/contenttype/forms">
-  <Display>DocumentLibraryForm</Display>
-  <Edit>DocumentLibraryForm</Edit>
-  <New>DocumentLibraryForm</New>
-</FormTemplates>
+<b:Sources xmlns:b="http://schemas.openxmlformats.org/officeDocument/2006/bibliography" xmlns="http://schemas.openxmlformats.org/officeDocument/2006/bibliography" SelectedStyle="\CHICAGO.XSL" StyleName="Chicago" Version="16"/>
 </file>
 
 <file path=customXml/itemProps1.xml><?xml version="1.0" encoding="utf-8"?>
@@ -50223,9 +49126,9 @@
 </file>
 
 <file path=customXml/itemProps2.xml><?xml version="1.0" encoding="utf-8"?>
-<ds:datastoreItem xmlns:ds="http://schemas.openxmlformats.org/officeDocument/2006/customXml" ds:itemID="{DD3D2CC8-E59A-4E1B-8420-59D968420D72}">
+<ds:datastoreItem xmlns:ds="http://schemas.openxmlformats.org/officeDocument/2006/customXml" ds:itemID="{DAFC9ED8-3E81-4514-A393-22E23F54F6DC}">
   <ds:schemaRefs>
-    <ds:schemaRef ds:uri="http://schemas.openxmlformats.org/officeDocument/2006/bibliography"/>
+    <ds:schemaRef ds:uri="http://schemas.microsoft.com/sharepoint/v3/contenttype/forms"/>
   </ds:schemaRefs>
 </ds:datastoreItem>
 </file>
@@ -50240,9 +49143,9 @@
 </file>
 
 <file path=customXml/itemProps4.xml><?xml version="1.0" encoding="utf-8"?>
-<ds:datastoreItem xmlns:ds="http://schemas.openxmlformats.org/officeDocument/2006/customXml" ds:itemID="{DAFC9ED8-3E81-4514-A393-22E23F54F6DC}">
+<ds:datastoreItem xmlns:ds="http://schemas.openxmlformats.org/officeDocument/2006/customXml" ds:itemID="{DD3D2CC8-E59A-4E1B-8420-59D968420D72}">
   <ds:schemaRefs>
-    <ds:schemaRef ds:uri="http://schemas.microsoft.com/sharepoint/v3/contenttype/forms"/>
+    <ds:schemaRef ds:uri="http://schemas.openxmlformats.org/officeDocument/2006/bibliography"/>
   </ds:schemaRefs>
 </ds:datastoreItem>
 </file>
</xml_diff>